<commit_message>
Added User manual version 2 and updated version 1 and added top 3 courses to version 2
</commit_message>
<xml_diff>
--- a/User manual/User-manual(1).docx
+++ b/User manual/User-manual(1).docx
@@ -1,6 +1,6 @@
 
 <file path=word/document.xml><?xml version="1.0" encoding="utf-8"?>
-<w:document xmlns:wpc="http://schemas.microsoft.com/office/word/2010/wordprocessingCanvas" xmlns:cx="http://schemas.microsoft.com/office/drawing/2014/chartex" xmlns:cx1="http://schemas.microsoft.com/office/drawing/2015/9/8/chartex" xmlns:cx2="http://schemas.microsoft.com/office/drawing/2015/10/21/chartex" xmlns:cx3="http://schemas.microsoft.com/office/drawing/2016/5/9/chartex" xmlns:cx4="http://schemas.microsoft.com/office/drawing/2016/5/10/chartex" xmlns:cx5="http://schemas.microsoft.com/office/drawing/2016/5/11/chartex" xmlns:cx6="http://schemas.microsoft.com/office/drawing/2016/5/12/chartex" xmlns:cx7="http://schemas.microsoft.com/office/drawing/2016/5/13/chartex" xmlns:cx8="http://schemas.microsoft.com/office/drawing/2016/5/14/chartex" xmlns:mc="http://schemas.openxmlformats.org/markup-compatibility/2006" xmlns:aink="http://schemas.microsoft.com/office/drawing/2016/ink" xmlns:am3d="http://schemas.microsoft.com/office/drawing/2017/model3d" xmlns:o="urn:schemas-microsoft-com:office:office" xmlns:r="http://schemas.openxmlformats.org/officeDocument/2006/relationships" xmlns:m="http://schemas.openxmlformats.org/officeDocument/2006/math" xmlns:v="urn:schemas-microsoft-com:vml" xmlns:wp14="http://schemas.microsoft.com/office/word/2010/wordprocessingDrawing" xmlns:wp="http://schemas.openxmlformats.org/drawingml/2006/wordprocessingDrawing" xmlns:w10="urn:schemas-microsoft-com:office:word" xmlns:w="http://schemas.openxmlformats.org/wordprocessingml/2006/main" xmlns:w14="http://schemas.microsoft.com/office/word/2010/wordml" xmlns:w15="http://schemas.microsoft.com/office/word/2012/wordml" xmlns:w16cex="http://schemas.microsoft.com/office/word/2018/wordml/cex" xmlns:w16cid="http://schemas.microsoft.com/office/word/2016/wordml/cid" xmlns:w16="http://schemas.microsoft.com/office/word/2018/wordml" xmlns:w16sdtdh="http://schemas.microsoft.com/office/word/2020/wordml/sdtdatahash" xmlns:w16se="http://schemas.microsoft.com/office/word/2015/wordml/symex" xmlns:wpg="http://schemas.microsoft.com/office/word/2010/wordprocessingGroup" xmlns:wpi="http://schemas.microsoft.com/office/word/2010/wordprocessingInk" xmlns:wne="http://schemas.microsoft.com/office/word/2006/wordml" xmlns:wps="http://schemas.microsoft.com/office/word/2010/wordprocessingShape" mc:Ignorable="w14 w15 w16se w16cid w16 w16cex w16sdtdh wp14">
+<w:document xmlns:wpc="http://schemas.microsoft.com/office/word/2010/wordprocessingCanvas" xmlns:cx="http://schemas.microsoft.com/office/drawing/2014/chartex" xmlns:cx1="http://schemas.microsoft.com/office/drawing/2015/9/8/chartex" xmlns:cx2="http://schemas.microsoft.com/office/drawing/2015/10/21/chartex" xmlns:cx3="http://schemas.microsoft.com/office/drawing/2016/5/9/chartex" xmlns:cx4="http://schemas.microsoft.com/office/drawing/2016/5/10/chartex" xmlns:cx5="http://schemas.microsoft.com/office/drawing/2016/5/11/chartex" xmlns:cx6="http://schemas.microsoft.com/office/drawing/2016/5/12/chartex" xmlns:cx7="http://schemas.microsoft.com/office/drawing/2016/5/13/chartex" xmlns:cx8="http://schemas.microsoft.com/office/drawing/2016/5/14/chartex" xmlns:mc="http://schemas.openxmlformats.org/markup-compatibility/2006" xmlns:aink="http://schemas.microsoft.com/office/drawing/2016/ink" xmlns:am3d="http://schemas.microsoft.com/office/drawing/2017/model3d" xmlns:o="urn:schemas-microsoft-com:office:office" xmlns:oel="http://schemas.microsoft.com/office/2019/extlst" xmlns:r="http://schemas.openxmlformats.org/officeDocument/2006/relationships" xmlns:m="http://schemas.openxmlformats.org/officeDocument/2006/math" xmlns:v="urn:schemas-microsoft-com:vml" xmlns:wp14="http://schemas.microsoft.com/office/word/2010/wordprocessingDrawing" xmlns:wp="http://schemas.openxmlformats.org/drawingml/2006/wordprocessingDrawing" xmlns:w10="urn:schemas-microsoft-com:office:word" xmlns:w="http://schemas.openxmlformats.org/wordprocessingml/2006/main" xmlns:w14="http://schemas.microsoft.com/office/word/2010/wordml" xmlns:w15="http://schemas.microsoft.com/office/word/2012/wordml" xmlns:w16cex="http://schemas.microsoft.com/office/word/2018/wordml/cex" xmlns:w16cid="http://schemas.microsoft.com/office/word/2016/wordml/cid" xmlns:w16="http://schemas.microsoft.com/office/word/2018/wordml" xmlns:w16du="http://schemas.microsoft.com/office/word/2023/wordml/word16du" xmlns:w16sdtdh="http://schemas.microsoft.com/office/word/2020/wordml/sdtdatahash" xmlns:w16sdtfl="http://schemas.microsoft.com/office/word/2024/wordml/sdtformatlock" xmlns:w16se="http://schemas.microsoft.com/office/word/2015/wordml/symex" xmlns:wpg="http://schemas.microsoft.com/office/word/2010/wordprocessingGroup" xmlns:wpi="http://schemas.microsoft.com/office/word/2010/wordprocessingInk" xmlns:wne="http://schemas.microsoft.com/office/word/2006/wordml" xmlns:wps="http://schemas.microsoft.com/office/word/2010/wordprocessingShape" mc:Ignorable="w14 w15 w16se w16cid w16 w16cex w16sdtdh w16sdtfl w16du wp14">
   <w:body>
     <w:p>
       <w:r>
@@ -71,7 +71,6 @@
                                 <w:dataBinding w:prefixMappings="xmlns:ns0='http://purl.org/dc/elements/1.1/' xmlns:ns1='http://schemas.openxmlformats.org/package/2006/metadata/core-properties' " w:xpath="/ns1:coreProperties[1]/ns0:title[1]" w:storeItemID="{6C3C8BC8-F283-45AE-878A-BAB7291924A1}"/>
                                 <w:text w:multiLine="1"/>
                               </w:sdtPr>
-                              <w:sdtEndPr/>
                               <w:sdtContent>
                                 <w:r>
                                   <w:rPr>
@@ -100,7 +99,6 @@
                                 <w:dataBinding w:prefixMappings="xmlns:ns0='http://purl.org/dc/elements/1.1/' xmlns:ns1='http://schemas.openxmlformats.org/package/2006/metadata/core-properties' " w:xpath="/ns1:coreProperties[1]/ns0:subject[1]" w:storeItemID="{6C3C8BC8-F283-45AE-878A-BAB7291924A1}"/>
                                 <w:text/>
                               </w:sdtPr>
-                              <w:sdtEndPr/>
                               <w:sdtContent>
                                 <w:r>
                                   <w:rPr>
@@ -260,7 +258,6 @@
                                 <w:docPartUnique/>
                               </w:docPartObj>
                             </w:sdtPr>
-                            <w:sdtEndPr/>
                             <w:sdtContent>
                               <w:p>
                                 <w:pPr>
@@ -298,39 +295,9 @@
                                     <w:dataBinding w:prefixMappings="xmlns:ns0='http://schemas.microsoft.com/office/2006/coverPageProps' " w:xpath="/ns0:CoverPageProperties[1]/ns0:Abstract[1]" w:storeItemID="{55AF091B-3C7A-41E3-B477-F2FDAA23CFDA}"/>
                                     <w:text w:multiLine="1"/>
                                   </w:sdtPr>
-                                  <w:sdtEndPr/>
                                   <w:sdtContent>
-                                    <w:proofErr w:type="spellStart"/>
                                     <w:r>
-                                      <w:t>Raiyan</w:t>
-                                    </w:r>
-                                    <w:proofErr w:type="spellEnd"/>
-                                    <w:r>
-                                      <w:t xml:space="preserve"> </w:t>
-                                    </w:r>
-                                    <w:proofErr w:type="spellStart"/>
-                                    <w:r>
-                                      <w:t>Alam</w:t>
-                                    </w:r>
-                                    <w:proofErr w:type="spellEnd"/>
-                                    <w:r>
-                                      <w:t xml:space="preserve">, Denis </w:t>
-                                    </w:r>
-                                    <w:proofErr w:type="spellStart"/>
-                                    <w:r>
-                                      <w:t>Gitman</w:t>
-                                    </w:r>
-                                    <w:proofErr w:type="spellEnd"/>
-                                    <w:r>
-                                      <w:t xml:space="preserve">, Neel Patkar, Harman Singh, </w:t>
-                                    </w:r>
-                                    <w:proofErr w:type="spellStart"/>
-                                    <w:r>
-                                      <w:t>Namit</w:t>
-                                    </w:r>
-                                    <w:proofErr w:type="spellEnd"/>
-                                    <w:r>
-                                      <w:t xml:space="preserve"> Singh, Arshdip Singh</w:t>
+                                      <w:t>Raiyan Alam, Denis Gitman, Neel Patkar, Harman Singh, Namit Singh, Arshdip Singh</w:t>
                                     </w:r>
                                   </w:sdtContent>
                                 </w:sdt>
@@ -635,7 +602,6 @@
           <w:docPartUnique/>
         </w:docPartObj>
       </w:sdtPr>
-      <w:sdtEndPr/>
       <w:sdtContent>
         <w:p>
           <w:pPr>
@@ -1476,7 +1442,6 @@
         <w:rPr>
           <w:lang w:val="en-IN"/>
         </w:rPr>
-        <w:lastRenderedPageBreak/>
         <w:t>1. Login / Registration</w:t>
       </w:r>
       <w:bookmarkEnd w:id="0"/>
@@ -1679,13 +1644,7 @@
         <w:rPr>
           <w:lang w:val="en-IN"/>
         </w:rPr>
-        <w:t>After verification, log in to a</w:t>
-      </w:r>
-      <w:r>
-        <w:rPr>
-          <w:lang w:val="en-IN"/>
-        </w:rPr>
-        <w:t>ccess your dashboard.</w:t>
+        <w:t>After verification, log in to access your dashboard.</w:t>
       </w:r>
     </w:p>
     <w:p>
@@ -1763,7 +1722,7 @@
               <wp:inline distT="0" distB="0" distL="0" distR="0" wp14:anchorId="378C8364" wp14:editId="24995E1C">
                 <wp:extent cx="5731510" cy="19050"/>
                 <wp:effectExtent l="0" t="0" r="0" b="0"/>
-                <wp:docPr id="9" name=""/>
+                <wp:docPr id="9" name="Rectangle 9"/>
                 <wp:cNvGraphicFramePr/>
                 <a:graphic xmlns:a="http://schemas.openxmlformats.org/drawingml/2006/main">
                   <a:graphicData uri="http://schemas.microsoft.com/office/word/2010/wordprocessingShape">
@@ -1979,7 +1938,7 @@
               <wp:inline distT="0" distB="0" distL="0" distR="0" wp14:anchorId="51FBFCAF" wp14:editId="4B19A2A3">
                 <wp:extent cx="5731510" cy="19050"/>
                 <wp:effectExtent l="0" t="0" r="0" b="0"/>
-                <wp:docPr id="11" name=""/>
+                <wp:docPr id="11" name="Rectangle 11"/>
                 <wp:cNvGraphicFramePr/>
                 <a:graphic xmlns:a="http://schemas.openxmlformats.org/drawingml/2006/main">
                   <a:graphicData uri="http://schemas.microsoft.com/office/word/2010/wordprocessingShape">
@@ -2031,13 +1990,7 @@
         <w:rPr>
           <w:lang w:val="en-IN"/>
         </w:rPr>
-        <w:t xml:space="preserve">3. </w:t>
-      </w:r>
-      <w:r>
-        <w:rPr>
-          <w:lang w:val="en-IN"/>
-        </w:rPr>
-        <w:t>Search and Filter Courses</w:t>
+        <w:t>3. Search and Filter Courses</w:t>
       </w:r>
       <w:bookmarkEnd w:id="2"/>
     </w:p>
@@ -2249,7 +2202,7 @@
               <wp:inline distT="0" distB="0" distL="0" distR="0" wp14:anchorId="225F9F1E" wp14:editId="49680050">
                 <wp:extent cx="5731510" cy="19050"/>
                 <wp:effectExtent l="0" t="0" r="0" b="0"/>
-                <wp:docPr id="14" name=""/>
+                <wp:docPr id="14" name="Rectangle 14"/>
                 <wp:cNvGraphicFramePr/>
                 <a:graphic xmlns:a="http://schemas.openxmlformats.org/drawingml/2006/main">
                   <a:graphicData uri="http://schemas.microsoft.com/office/word/2010/wordprocessingShape">
@@ -2301,13 +2254,7 @@
         <w:rPr>
           <w:lang w:val="en-IN"/>
         </w:rPr>
-        <w:t xml:space="preserve">4. Grade </w:t>
-      </w:r>
-      <w:r>
-        <w:rPr>
-          <w:lang w:val="en-IN"/>
-        </w:rPr>
-        <w:t>Tracker</w:t>
+        <w:t>4. Grade Tracker</w:t>
       </w:r>
       <w:bookmarkEnd w:id="3"/>
     </w:p>
@@ -2559,7 +2506,7 @@
               <wp:inline distT="0" distB="0" distL="0" distR="0" wp14:anchorId="53208D0E" wp14:editId="22D0246F">
                 <wp:extent cx="5731510" cy="19050"/>
                 <wp:effectExtent l="0" t="0" r="0" b="0"/>
-                <wp:docPr id="18" name=""/>
+                <wp:docPr id="18" name="Rectangle 18"/>
                 <wp:cNvGraphicFramePr/>
                 <a:graphic xmlns:a="http://schemas.openxmlformats.org/drawingml/2006/main">
                   <a:graphicData uri="http://schemas.microsoft.com/office/word/2010/wordprocessingShape">
@@ -2612,13 +2559,7 @@
           <w:lang w:val="en-IN"/>
         </w:rPr>
         <w:lastRenderedPageBreak/>
-        <w:t xml:space="preserve">5. View </w:t>
-      </w:r>
-      <w:r>
-        <w:rPr>
-          <w:lang w:val="en-IN"/>
-        </w:rPr>
-        <w:t>Course Stats</w:t>
+        <w:t>5. View Course Stats</w:t>
       </w:r>
       <w:bookmarkEnd w:id="4"/>
     </w:p>
@@ -2774,7 +2715,7 @@
               <wp:inline distT="0" distB="0" distL="0" distR="0" wp14:anchorId="2D16EAF4" wp14:editId="63406549">
                 <wp:extent cx="5731510" cy="19050"/>
                 <wp:effectExtent l="0" t="0" r="0" b="0"/>
-                <wp:docPr id="20" name=""/>
+                <wp:docPr id="20" name="Rectangle 20"/>
                 <wp:cNvGraphicFramePr/>
                 <a:graphic xmlns:a="http://schemas.openxmlformats.org/drawingml/2006/main">
                   <a:graphicData uri="http://schemas.microsoft.com/office/word/2010/wordprocessingShape">
@@ -2826,17 +2767,9 @@
         <w:rPr>
           <w:lang w:val="en-IN"/>
         </w:rPr>
-        <w:t xml:space="preserve">6. Viewing a </w:t>
-      </w:r>
-      <w:proofErr w:type="spellStart"/>
-      <w:r>
-        <w:rPr>
-          <w:lang w:val="en-IN"/>
-        </w:rPr>
-        <w:t>Leaderboard</w:t>
+        <w:t>6. Viewing a Leaderboard</w:t>
       </w:r>
       <w:bookmarkEnd w:id="5"/>
-      <w:proofErr w:type="spellEnd"/>
     </w:p>
     <w:p>
       <w:pPr>
@@ -2861,37 +2794,10 @@
           <w:b/>
           <w:bCs/>
         </w:rPr>
-        <w:t xml:space="preserve">Student XP </w:t>
-      </w:r>
-      <w:proofErr w:type="spellStart"/>
-      <w:r>
-        <w:rPr>
-          <w:b/>
-          <w:bCs/>
-        </w:rPr>
-        <w:t>Leaderboard</w:t>
-      </w:r>
-      <w:proofErr w:type="spellEnd"/>
-      <w:r>
-        <w:rPr>
-          <w:b/>
-          <w:bCs/>
-        </w:rPr>
-        <w:t xml:space="preserve"> </w:t>
-      </w:r>
-      <w:r>
-        <w:t xml:space="preserve">is a Java Swing-based desktop application that displays a </w:t>
-      </w:r>
-      <w:proofErr w:type="spellStart"/>
-      <w:r>
-        <w:t>leaderboard</w:t>
-      </w:r>
-      <w:proofErr w:type="spellEnd"/>
-      <w:r>
-        <w:t xml:space="preserve"> of students ranked by their Experience Points (XP). The data is fetched from a MySQL database and presented in a user-friendly graphical interface. The application</w:t>
-      </w:r>
-      <w:r>
-        <w:t xml:space="preserve"> supports pagination, refreshing, and viewing detailed information about each student.</w:t>
+        <w:t xml:space="preserve">Student XP Leaderboard </w:t>
+      </w:r>
+      <w:r>
+        <w:t>is a Java Swing-based desktop application that displays a leaderboard of students ranked by their Experience Points (XP). The data is fetched from a MySQL database and presented in a user-friendly graphical interface. The application supports pagination, refreshing, and viewing detailed information about each student.</w:t>
       </w:r>
     </w:p>
     <w:p>
@@ -2905,7 +2811,7 @@
               <wp:inline distT="0" distB="0" distL="0" distR="0" wp14:anchorId="387A88C6" wp14:editId="4FDDD2F2">
                 <wp:extent cx="5731510" cy="635"/>
                 <wp:effectExtent l="0" t="0" r="0" b="0"/>
-                <wp:docPr id="21" name=""/>
+                <wp:docPr id="21" name="Rectangle 21"/>
                 <wp:cNvGraphicFramePr/>
                 <a:graphic xmlns:a="http://schemas.openxmlformats.org/drawingml/2006/main">
                   <a:graphicData uri="http://schemas.microsoft.com/office/word/2010/wordprocessingShape">
@@ -3020,36 +2926,11 @@
           <w:b/>
           <w:bCs/>
         </w:rPr>
-        <w:t xml:space="preserve">Dynamic </w:t>
-      </w:r>
-      <w:proofErr w:type="spellStart"/>
-      <w:r>
-        <w:rPr>
-          <w:b/>
-          <w:bCs/>
-        </w:rPr>
-        <w:t>Leaderboard</w:t>
-      </w:r>
-      <w:proofErr w:type="spellEnd"/>
-      <w:r>
-        <w:rPr>
-          <w:b/>
-          <w:bCs/>
-        </w:rPr>
-        <w:t xml:space="preserve"> </w:t>
-      </w:r>
-      <w:proofErr w:type="gramStart"/>
-      <w:r>
-        <w:rPr>
-          <w:b/>
-          <w:bCs/>
-        </w:rPr>
-        <w:t xml:space="preserve">Display </w:t>
+        <w:t xml:space="preserve">Dynamic Leaderboard Display </w:t>
       </w:r>
       <w:r>
         <w:t>:</w:t>
       </w:r>
-      <w:proofErr w:type="gramEnd"/>
     </w:p>
     <w:p>
       <w:pPr>
@@ -3078,25 +2959,16 @@
       <w:pPr>
         <w:ind w:left="720"/>
       </w:pPr>
-      <w:proofErr w:type="gramStart"/>
-      <w:r>
-        <w:rPr>
-          <w:b/>
-          <w:bCs/>
-        </w:rPr>
-        <w:t>Pagin</w:t>
-      </w:r>
-      <w:r>
-        <w:rPr>
-          <w:b/>
-          <w:bCs/>
-        </w:rPr>
-        <w:t xml:space="preserve">ation </w:t>
+      <w:r>
+        <w:rPr>
+          <w:b/>
+          <w:bCs/>
+        </w:rPr>
+        <w:t xml:space="preserve">Pagination </w:t>
       </w:r>
       <w:r>
         <w:t>:</w:t>
       </w:r>
-      <w:proofErr w:type="gramEnd"/>
     </w:p>
     <w:p>
       <w:pPr>
@@ -3129,20 +3001,11 @@
           <w:b/>
           <w:bCs/>
         </w:rPr>
-        <w:t xml:space="preserve">Refresh </w:t>
-      </w:r>
-      <w:proofErr w:type="gramStart"/>
-      <w:r>
-        <w:rPr>
-          <w:b/>
-          <w:bCs/>
-        </w:rPr>
-        <w:t xml:space="preserve">Button </w:t>
+        <w:t xml:space="preserve">Refresh Button </w:t>
       </w:r>
       <w:r>
         <w:t>:</w:t>
       </w:r>
-      <w:proofErr w:type="gramEnd"/>
     </w:p>
     <w:p>
       <w:pPr>
@@ -3164,20 +3027,11 @@
           <w:b/>
           <w:bCs/>
         </w:rPr>
-        <w:t xml:space="preserve">Row </w:t>
-      </w:r>
-      <w:proofErr w:type="gramStart"/>
-      <w:r>
-        <w:rPr>
-          <w:b/>
-          <w:bCs/>
-        </w:rPr>
-        <w:t xml:space="preserve">Details </w:t>
+        <w:t xml:space="preserve">Row Details </w:t>
       </w:r>
       <w:r>
         <w:t>:</w:t>
       </w:r>
-      <w:proofErr w:type="gramEnd"/>
     </w:p>
     <w:p>
       <w:pPr>
@@ -3187,17 +3041,13 @@
         </w:numPr>
       </w:pPr>
       <w:r>
-        <w:t>Clicking on a row in the table</w:t>
-      </w:r>
-      <w:r>
-        <w:t xml:space="preserve"> displays a popup with the selected student's username and XP.</w:t>
+        <w:t>Clicking on a row in the table displays a popup with the selected student's username and XP.</w:t>
       </w:r>
     </w:p>
     <w:p>
       <w:pPr>
         <w:ind w:left="720"/>
       </w:pPr>
-      <w:proofErr w:type="gramStart"/>
       <w:r>
         <w:rPr>
           <w:b/>
@@ -3208,7 +3058,6 @@
       <w:r>
         <w:t>:</w:t>
       </w:r>
-      <w:proofErr w:type="gramEnd"/>
     </w:p>
     <w:p>
       <w:pPr>
@@ -3276,29 +3125,11 @@
           <w:b/>
           <w:bCs/>
         </w:rPr>
-        <w:t xml:space="preserve">"Student XP </w:t>
-      </w:r>
-      <w:proofErr w:type="spellStart"/>
-      <w:r>
-        <w:rPr>
-          <w:b/>
-          <w:bCs/>
-        </w:rPr>
-        <w:t>Leaderboard</w:t>
-      </w:r>
-      <w:proofErr w:type="spellEnd"/>
-      <w:proofErr w:type="gramStart"/>
-      <w:r>
-        <w:rPr>
-          <w:b/>
-          <w:bCs/>
-        </w:rPr>
-        <w:t xml:space="preserve">" </w:t>
+        <w:t xml:space="preserve">"Student XP Leaderboard" </w:t>
       </w:r>
       <w:r>
         <w:t>.</w:t>
       </w:r>
-      <w:proofErr w:type="gramEnd"/>
     </w:p>
     <w:p>
       <w:pPr>
@@ -3307,10 +3138,7 @@
         </w:tabs>
       </w:pPr>
       <w:r>
-        <w:t xml:space="preserve">Provides a clean and </w:t>
-      </w:r>
-      <w:r>
-        <w:t>professional look with a blue background.</w:t>
+        <w:t>Provides a clean and professional look with a blue background.</w:t>
       </w:r>
     </w:p>
     <w:p>
@@ -3335,19 +3163,10 @@
         </w:tabs>
       </w:pPr>
       <w:r>
-        <w:t xml:space="preserve">Shows the </w:t>
-      </w:r>
-      <w:proofErr w:type="spellStart"/>
-      <w:r>
-        <w:t>leaderboard</w:t>
-      </w:r>
-      <w:proofErr w:type="spellEnd"/>
-      <w:r>
-        <w:t xml:space="preserve"> with the following columns:</w:t>
-      </w:r>
-    </w:p>
-    <w:p>
-      <w:proofErr w:type="gramStart"/>
+        <w:t>Shows the leaderboard with the following columns:</w:t>
+      </w:r>
+    </w:p>
+    <w:p>
       <w:r>
         <w:rPr>
           <w:b/>
@@ -3356,15 +3175,10 @@
         <w:t xml:space="preserve">Rank </w:t>
       </w:r>
       <w:r>
-        <w:t>:</w:t>
-      </w:r>
-      <w:proofErr w:type="gramEnd"/>
-      <w:r>
-        <w:t xml:space="preserve"> The student's position based on XP.</w:t>
-      </w:r>
-    </w:p>
-    <w:p>
-      <w:proofErr w:type="gramStart"/>
+        <w:t>: The student's position based on XP.</w:t>
+      </w:r>
+    </w:p>
+    <w:p>
       <w:r>
         <w:rPr>
           <w:b/>
@@ -3373,15 +3187,10 @@
         <w:t xml:space="preserve">Username </w:t>
       </w:r>
       <w:r>
-        <w:t>:</w:t>
-      </w:r>
-      <w:proofErr w:type="gramEnd"/>
-      <w:r>
-        <w:t xml:space="preserve"> The name of the student.</w:t>
-      </w:r>
-    </w:p>
-    <w:p>
-      <w:proofErr w:type="gramStart"/>
+        <w:t>: The name of the student.</w:t>
+      </w:r>
+    </w:p>
+    <w:p>
       <w:r>
         <w:rPr>
           <w:b/>
@@ -3390,11 +3199,7 @@
         <w:t xml:space="preserve">XP </w:t>
       </w:r>
       <w:r>
-        <w:t>:</w:t>
-      </w:r>
-      <w:proofErr w:type="gramEnd"/>
-      <w:r>
-        <w:t xml:space="preserve"> The student's experience points.</w:t>
+        <w:t>: The student's experience points.</w:t>
       </w:r>
     </w:p>
     <w:p>
@@ -3404,10 +3209,7 @@
         </w:tabs>
       </w:pPr>
       <w:r>
-        <w:t xml:space="preserve">Rows are styled with alternating colours </w:t>
-      </w:r>
-      <w:r>
-        <w:t>(light blue and white) for readability.</w:t>
+        <w:t>Rows are styled with alternating colours (light blue and white) for readability.</w:t>
       </w:r>
     </w:p>
     <w:p>
@@ -3441,7 +3243,6 @@
       <w:pPr>
         <w:ind w:left="1440"/>
       </w:pPr>
-      <w:proofErr w:type="gramStart"/>
       <w:r>
         <w:rPr>
           <w:b/>
@@ -3450,18 +3251,13 @@
         <w:t xml:space="preserve">Previous </w:t>
       </w:r>
       <w:r>
-        <w:t>:</w:t>
-      </w:r>
-      <w:proofErr w:type="gramEnd"/>
-      <w:r>
-        <w:t xml:space="preserve"> Navigate to the previous page of students.</w:t>
+        <w:t>: Navigate to the previous page of students.</w:t>
       </w:r>
     </w:p>
     <w:p>
       <w:pPr>
         <w:ind w:left="1440"/>
       </w:pPr>
-      <w:proofErr w:type="gramStart"/>
       <w:r>
         <w:rPr>
           <w:b/>
@@ -3470,18 +3266,13 @@
         <w:t xml:space="preserve">Next </w:t>
       </w:r>
       <w:r>
-        <w:t>:</w:t>
-      </w:r>
-      <w:proofErr w:type="gramEnd"/>
-      <w:r>
-        <w:t xml:space="preserve"> Navigate to the next page of students.</w:t>
+        <w:t>: Navigate to the next page of students.</w:t>
       </w:r>
     </w:p>
     <w:p>
       <w:pPr>
         <w:ind w:left="1440"/>
       </w:pPr>
-      <w:proofErr w:type="gramStart"/>
       <w:r>
         <w:rPr>
           <w:b/>
@@ -3490,11 +3281,7 @@
         <w:t xml:space="preserve">Refresh </w:t>
       </w:r>
       <w:r>
-        <w:t>:</w:t>
-      </w:r>
-      <w:proofErr w:type="gramEnd"/>
-      <w:r>
-        <w:t xml:space="preserve"> Reload the data from the database to reflect any changes.</w:t>
+        <w:t>: Reload the data from the database to reflect any changes.</w:t>
       </w:r>
     </w:p>
     <w:p>
@@ -3511,7 +3298,7 @@
               <wp:inline distT="0" distB="0" distL="0" distR="0" wp14:anchorId="5FEB9FDB" wp14:editId="6D608194">
                 <wp:extent cx="5731510" cy="635"/>
                 <wp:effectExtent l="0" t="0" r="0" b="0"/>
-                <wp:docPr id="23" name=""/>
+                <wp:docPr id="23" name="Rectangle 23"/>
                 <wp:cNvGraphicFramePr/>
                 <a:graphic xmlns:a="http://schemas.openxmlformats.org/drawingml/2006/main">
                   <a:graphicData uri="http://schemas.microsoft.com/office/word/2010/wordprocessingShape">
@@ -3563,20 +3350,11 @@
           <w:b/>
           <w:bCs/>
         </w:rPr>
-        <w:t xml:space="preserve">View Student </w:t>
-      </w:r>
-      <w:proofErr w:type="gramStart"/>
-      <w:r>
-        <w:rPr>
-          <w:b/>
-          <w:bCs/>
-        </w:rPr>
-        <w:t xml:space="preserve">Details </w:t>
+        <w:t xml:space="preserve">View Student Details </w:t>
       </w:r>
       <w:r>
         <w:t>:</w:t>
       </w:r>
-      <w:proofErr w:type="gramEnd"/>
     </w:p>
     <w:p>
       <w:pPr>
@@ -3599,20 +3377,11 @@
           <w:b/>
           <w:bCs/>
         </w:rPr>
-        <w:t xml:space="preserve">Navigate </w:t>
-      </w:r>
-      <w:proofErr w:type="gramStart"/>
-      <w:r>
-        <w:rPr>
-          <w:b/>
-          <w:bCs/>
-        </w:rPr>
-        <w:t xml:space="preserve">Pages </w:t>
+        <w:t xml:space="preserve">Navigate Pages </w:t>
       </w:r>
       <w:r>
         <w:t>:</w:t>
       </w:r>
-      <w:proofErr w:type="gramEnd"/>
     </w:p>
     <w:p>
       <w:pPr>
@@ -3654,30 +3423,18 @@
           <w:b/>
           <w:bCs/>
         </w:rPr>
-        <w:t xml:space="preserve">Refresh </w:t>
-      </w:r>
-      <w:proofErr w:type="gramStart"/>
-      <w:r>
-        <w:rPr>
-          <w:b/>
-          <w:bCs/>
-        </w:rPr>
-        <w:t xml:space="preserve">Data </w:t>
+        <w:t xml:space="preserve">Refresh Data </w:t>
       </w:r>
       <w:r>
         <w:t>:</w:t>
       </w:r>
-      <w:proofErr w:type="gramEnd"/>
     </w:p>
     <w:p>
       <w:pPr>
         <w:ind w:left="1440"/>
       </w:pPr>
       <w:r>
-        <w:t>If new students are</w:t>
-      </w:r>
-      <w:r>
-        <w:t xml:space="preserve"> added to the database or XP values are updated, click the </w:t>
+        <w:t xml:space="preserve">If new students are added to the database or XP values are updated, click the </w:t>
       </w:r>
       <w:r>
         <w:rPr>
@@ -3723,7 +3480,7 @@
               <wp:inline distT="0" distB="0" distL="0" distR="0" wp14:anchorId="2A57EF9F" wp14:editId="0A906D1F">
                 <wp:extent cx="5731510" cy="19050"/>
                 <wp:effectExtent l="0" t="0" r="0" b="0"/>
-                <wp:docPr id="24" name=""/>
+                <wp:docPr id="24" name="Rectangle 24"/>
                 <wp:cNvGraphicFramePr/>
                 <a:graphic xmlns:a="http://schemas.openxmlformats.org/drawingml/2006/main">
                   <a:graphicData uri="http://schemas.microsoft.com/office/word/2010/wordprocessingShape">
@@ -4036,13 +3793,7 @@
         <w:rPr>
           <w:lang w:val="en-IN"/>
         </w:rPr>
-        <w:t>After 5 courses have been marked as completed, the bronze badge will be awar</w:t>
-      </w:r>
-      <w:r>
-        <w:rPr>
-          <w:lang w:val="en-IN"/>
-        </w:rPr>
-        <w:t>ded</w:t>
+        <w:t>After 5 courses have been marked as completed, the bronze badge will be awarded</w:t>
       </w:r>
     </w:p>
     <w:p>
@@ -4256,7 +4007,7 @@
               <wp:inline distT="0" distB="0" distL="0" distR="0" wp14:anchorId="4234E199" wp14:editId="01BF883F">
                 <wp:extent cx="5731510" cy="19050"/>
                 <wp:effectExtent l="0" t="0" r="0" b="0"/>
-                <wp:docPr id="31" name=""/>
+                <wp:docPr id="31" name="Rectangle 31"/>
                 <wp:cNvGraphicFramePr/>
                 <a:graphic xmlns:a="http://schemas.openxmlformats.org/drawingml/2006/main">
                   <a:graphicData uri="http://schemas.microsoft.com/office/word/2010/wordprocessingShape">
@@ -4307,746 +4058,19 @@
       </w:r>
     </w:p>
     <w:p>
-      <w:pPr>
-        <w:pStyle w:val="Heading1"/>
-        <w:rPr>
-          <w:lang w:val="en-IN"/>
-        </w:rPr>
-      </w:pPr>
-      <w:bookmarkStart w:id="7" w:name="_Toc193295094"/>
-      <w:r>
+      <w:r>
+        <w:rPr>
+          <w:b/>
+          <w:bCs/>
+          <w:lang w:val="en-IN"/>
+        </w:rPr>
         <w:lastRenderedPageBreak/>
-        <w:t>8. Flashcard maker</w:t>
-      </w:r>
-      <w:bookmarkEnd w:id="7"/>
-    </w:p>
-    <w:p>
-      <w:pPr>
-        <w:rPr>
-          <w:lang w:val="en-IN"/>
-        </w:rPr>
-      </w:pPr>
-      <w:r>
-        <w:rPr>
-          <w:b/>
-          <w:bCs/>
-          <w:lang w:val="en-IN"/>
-        </w:rPr>
-        <w:t>Overview: Create flashcards and test users’</w:t>
-      </w:r>
-      <w:r>
-        <w:rPr>
-          <w:b/>
-          <w:bCs/>
-          <w:lang w:val="en-IN"/>
-        </w:rPr>
-        <w:t xml:space="preserve"> knowledge</w:t>
-      </w:r>
-    </w:p>
-    <w:p>
-      <w:pPr>
-        <w:rPr>
-          <w:lang w:val="en-IN"/>
-        </w:rPr>
-      </w:pPr>
-      <w:r>
-        <w:t>This feat</w:t>
-      </w:r>
-      <w:r>
-        <w:t>ure of the application will allow users to create their own flashcards to help them revises for their courses and test their knowledge. When the program is first loaded the main menu will load up so that the user can create their flashcard or play the game</w:t>
-      </w:r>
-      <w:r>
-        <w:t>.</w:t>
-      </w:r>
-    </w:p>
-    <w:p>
-      <w:pPr>
-        <w:rPr>
-          <w:lang w:val="en-IN"/>
-        </w:rPr>
-      </w:pPr>
-      <w:r>
-        <w:rPr>
-          <w:noProof/>
-        </w:rPr>
-        <w:drawing>
-          <wp:anchor distT="0" distB="0" distL="0" distR="0" simplePos="0" relativeHeight="37" behindDoc="0" locked="0" layoutInCell="0" allowOverlap="1" wp14:anchorId="2BDA8E50" wp14:editId="7A925A18">
-            <wp:simplePos x="0" y="0"/>
-            <wp:positionH relativeFrom="column">
-              <wp:align>center</wp:align>
-            </wp:positionH>
-            <wp:positionV relativeFrom="paragraph">
-              <wp:posOffset>635</wp:posOffset>
-            </wp:positionV>
-            <wp:extent cx="2545715" cy="1478280"/>
-            <wp:effectExtent l="0" t="0" r="0" b="0"/>
-            <wp:wrapSquare wrapText="largest"/>
-            <wp:docPr id="32" name="Image21"/>
-            <wp:cNvGraphicFramePr>
-              <a:graphicFrameLocks xmlns:a="http://schemas.openxmlformats.org/drawingml/2006/main" noChangeAspect="1"/>
-            </wp:cNvGraphicFramePr>
-            <a:graphic xmlns:a="http://schemas.openxmlformats.org/drawingml/2006/main">
-              <a:graphicData uri="http://schemas.openxmlformats.org/drawingml/2006/picture">
-                <pic:pic xmlns:pic="http://schemas.openxmlformats.org/drawingml/2006/picture">
-                  <pic:nvPicPr>
-                    <pic:cNvPr id="32" name="Image21"/>
-                    <pic:cNvPicPr>
-                      <a:picLocks noChangeAspect="1" noChangeArrowheads="1"/>
-                    </pic:cNvPicPr>
-                  </pic:nvPicPr>
-                  <pic:blipFill>
-                    <a:blip r:embed="rId27"/>
-                    <a:stretch>
-                      <a:fillRect/>
-                    </a:stretch>
-                  </pic:blipFill>
-                  <pic:spPr bwMode="auto">
-                    <a:xfrm>
-                      <a:off x="0" y="0"/>
-                      <a:ext cx="2545715" cy="1478280"/>
-                    </a:xfrm>
-                    <a:prstGeom prst="rect">
-                      <a:avLst/>
-                    </a:prstGeom>
-                  </pic:spPr>
-                </pic:pic>
-              </a:graphicData>
-            </a:graphic>
-          </wp:anchor>
-        </w:drawing>
-      </w:r>
-    </w:p>
-    <w:p>
-      <w:pPr>
-        <w:rPr>
-          <w:lang w:val="en-IN"/>
-        </w:rPr>
-      </w:pPr>
-    </w:p>
-    <w:p>
-      <w:pPr>
-        <w:rPr>
-          <w:lang w:val="en-IN"/>
-        </w:rPr>
-      </w:pPr>
-    </w:p>
-    <w:p>
-      <w:pPr>
-        <w:rPr>
-          <w:lang w:val="en-IN"/>
-        </w:rPr>
-      </w:pPr>
-    </w:p>
-    <w:p>
-      <w:pPr>
-        <w:rPr>
-          <w:lang w:val="en-IN"/>
-        </w:rPr>
-      </w:pPr>
-    </w:p>
-    <w:p>
-      <w:pPr>
-        <w:rPr>
-          <w:lang w:val="en-IN"/>
-        </w:rPr>
-      </w:pPr>
-    </w:p>
-    <w:p>
-      <w:pPr>
-        <w:rPr>
-          <w:lang w:val="en-IN"/>
-        </w:rPr>
-      </w:pPr>
-      <w:r>
-        <w:t>This program works by first having the user to create their flashcards with the help of validations and other features of the program such as the remove button if they don’t want the flashcard any more. This ensures that no issues arise</w:t>
-      </w:r>
-      <w:r>
-        <w:t xml:space="preserve"> in the ne</w:t>
-      </w:r>
-      <w:r>
-        <w:t>xt phase and that the flashcards are accurately correct to what the user wants.</w:t>
-      </w:r>
-    </w:p>
-    <w:p>
-      <w:pPr>
-        <w:rPr>
-          <w:lang w:val="en-IN"/>
-        </w:rPr>
-      </w:pPr>
-    </w:p>
-    <w:p>
-      <w:pPr>
-        <w:rPr>
-          <w:lang w:val="en-IN"/>
-        </w:rPr>
-      </w:pPr>
-      <w:r>
-        <w:rPr>
-          <w:noProof/>
-        </w:rPr>
-        <w:drawing>
-          <wp:anchor distT="0" distB="0" distL="0" distR="0" simplePos="0" relativeHeight="33" behindDoc="0" locked="0" layoutInCell="0" allowOverlap="1" wp14:anchorId="5B97430D" wp14:editId="54F43F22">
-            <wp:simplePos x="0" y="0"/>
-            <wp:positionH relativeFrom="column">
-              <wp:posOffset>436245</wp:posOffset>
-            </wp:positionH>
-            <wp:positionV relativeFrom="paragraph">
-              <wp:posOffset>90170</wp:posOffset>
-            </wp:positionV>
-            <wp:extent cx="3540125" cy="2179955"/>
-            <wp:effectExtent l="0" t="0" r="0" b="0"/>
-            <wp:wrapSquare wrapText="largest"/>
-            <wp:docPr id="33" name="Image1"/>
-            <wp:cNvGraphicFramePr>
-              <a:graphicFrameLocks xmlns:a="http://schemas.openxmlformats.org/drawingml/2006/main" noChangeAspect="1"/>
-            </wp:cNvGraphicFramePr>
-            <a:graphic xmlns:a="http://schemas.openxmlformats.org/drawingml/2006/main">
-              <a:graphicData uri="http://schemas.openxmlformats.org/drawingml/2006/picture">
-                <pic:pic xmlns:pic="http://schemas.openxmlformats.org/drawingml/2006/picture">
-                  <pic:nvPicPr>
-                    <pic:cNvPr id="33" name="Image1"/>
-                    <pic:cNvPicPr>
-                      <a:picLocks noChangeAspect="1" noChangeArrowheads="1"/>
-                    </pic:cNvPicPr>
-                  </pic:nvPicPr>
-                  <pic:blipFill>
-                    <a:blip r:embed="rId28"/>
-                    <a:stretch>
-                      <a:fillRect/>
-                    </a:stretch>
-                  </pic:blipFill>
-                  <pic:spPr bwMode="auto">
-                    <a:xfrm>
-                      <a:off x="0" y="0"/>
-                      <a:ext cx="3540125" cy="2179955"/>
-                    </a:xfrm>
-                    <a:prstGeom prst="rect">
-                      <a:avLst/>
-                    </a:prstGeom>
-                  </pic:spPr>
-                </pic:pic>
-              </a:graphicData>
-            </a:graphic>
-          </wp:anchor>
-        </w:drawing>
-      </w:r>
-    </w:p>
-    <w:p>
-      <w:pPr>
-        <w:rPr>
-          <w:lang w:val="en-IN"/>
-        </w:rPr>
-      </w:pPr>
-    </w:p>
-    <w:p>
-      <w:pPr>
-        <w:rPr>
-          <w:lang w:val="en-IN"/>
-        </w:rPr>
-      </w:pPr>
-    </w:p>
-    <w:p>
-      <w:pPr>
-        <w:rPr>
-          <w:lang w:val="en-IN"/>
-        </w:rPr>
-      </w:pPr>
-    </w:p>
-    <w:p>
-      <w:pPr>
-        <w:rPr>
-          <w:lang w:val="en-IN"/>
-        </w:rPr>
-      </w:pPr>
-    </w:p>
-    <w:p>
-      <w:pPr>
-        <w:rPr>
-          <w:lang w:val="en-IN"/>
-        </w:rPr>
-      </w:pPr>
-    </w:p>
-    <w:p>
-      <w:pPr>
-        <w:rPr>
-          <w:lang w:val="en-IN"/>
-        </w:rPr>
-      </w:pPr>
-    </w:p>
-    <w:p>
-      <w:pPr>
-        <w:rPr>
-          <w:lang w:val="en-IN"/>
-        </w:rPr>
-      </w:pPr>
-    </w:p>
-    <w:p>
-      <w:pPr>
-        <w:rPr>
-          <w:lang w:val="en-IN"/>
-        </w:rPr>
-      </w:pPr>
-    </w:p>
-    <w:p>
-      <w:pPr>
-        <w:rPr>
-          <w:lang w:val="en-IN"/>
-        </w:rPr>
-      </w:pPr>
-    </w:p>
-    <w:p>
-      <w:pPr>
-        <w:rPr>
-          <w:lang w:val="en-IN"/>
-        </w:rPr>
-      </w:pPr>
-      <w:r>
-        <w:t xml:space="preserve">After the user is happy with their </w:t>
-      </w:r>
-      <w:proofErr w:type="gramStart"/>
-      <w:r>
-        <w:t>flashcards</w:t>
-      </w:r>
-      <w:proofErr w:type="gramEnd"/>
-      <w:r>
-        <w:t xml:space="preserve"> they can participate in the game mode to test their knowledge in a timely manner if t</w:t>
-      </w:r>
-      <w:r>
-        <w:t xml:space="preserve">hey would like to. The user </w:t>
-      </w:r>
-      <w:r>
-        <w:t>will be first asked to select how long they would want their timer to be on for with a range of options from 2mins, 5mins, 10mins of unlimited time.</w:t>
-      </w:r>
-    </w:p>
-    <w:p>
-      <w:pPr>
-        <w:rPr>
-          <w:lang w:val="en-IN"/>
-        </w:rPr>
-      </w:pPr>
-      <w:r>
-        <w:rPr>
-          <w:noProof/>
-        </w:rPr>
-        <w:drawing>
-          <wp:anchor distT="0" distB="0" distL="0" distR="0" simplePos="0" relativeHeight="34" behindDoc="0" locked="0" layoutInCell="0" allowOverlap="1" wp14:anchorId="3926ED65" wp14:editId="256E00B4">
-            <wp:simplePos x="0" y="0"/>
-            <wp:positionH relativeFrom="column">
-              <wp:posOffset>379730</wp:posOffset>
-            </wp:positionH>
-            <wp:positionV relativeFrom="paragraph">
-              <wp:posOffset>133985</wp:posOffset>
-            </wp:positionV>
-            <wp:extent cx="2144395" cy="1085215"/>
-            <wp:effectExtent l="0" t="0" r="0" b="0"/>
-            <wp:wrapSquare wrapText="largest"/>
-            <wp:docPr id="34" name="Image18"/>
-            <wp:cNvGraphicFramePr>
-              <a:graphicFrameLocks xmlns:a="http://schemas.openxmlformats.org/drawingml/2006/main" noChangeAspect="1"/>
-            </wp:cNvGraphicFramePr>
-            <a:graphic xmlns:a="http://schemas.openxmlformats.org/drawingml/2006/main">
-              <a:graphicData uri="http://schemas.openxmlformats.org/drawingml/2006/picture">
-                <pic:pic xmlns:pic="http://schemas.openxmlformats.org/drawingml/2006/picture">
-                  <pic:nvPicPr>
-                    <pic:cNvPr id="34" name="Image18"/>
-                    <pic:cNvPicPr>
-                      <a:picLocks noChangeAspect="1" noChangeArrowheads="1"/>
-                    </pic:cNvPicPr>
-                  </pic:nvPicPr>
-                  <pic:blipFill>
-                    <a:blip r:embed="rId29"/>
-                    <a:stretch>
-                      <a:fillRect/>
-                    </a:stretch>
-                  </pic:blipFill>
-                  <pic:spPr bwMode="auto">
-                    <a:xfrm>
-                      <a:off x="0" y="0"/>
-                      <a:ext cx="2144395" cy="1085215"/>
-                    </a:xfrm>
-                    <a:prstGeom prst="rect">
-                      <a:avLst/>
-                    </a:prstGeom>
-                  </pic:spPr>
-                </pic:pic>
-              </a:graphicData>
-            </a:graphic>
-          </wp:anchor>
-        </w:drawing>
-      </w:r>
-    </w:p>
-    <w:p>
-      <w:pPr>
-        <w:rPr>
-          <w:lang w:val="en-IN"/>
-        </w:rPr>
-      </w:pPr>
-    </w:p>
-    <w:p>
-      <w:r>
-        <w:t>After the user has their option from above, the game will begin after they click on “start game” and the</w:t>
-      </w:r>
-      <w:r>
-        <w:t xml:space="preserve"> timer will start if they have selected any. The users </w:t>
-      </w:r>
-      <w:r>
-        <w:lastRenderedPageBreak/>
-        <w:t xml:space="preserve">will be asked questions from the </w:t>
-      </w:r>
-      <w:r>
-        <w:t>flashcards they have created and will have to answer them. The user’s</w:t>
-      </w:r>
-      <w:r>
-        <w:t xml:space="preserve"> input will be checked if its correct in which case a correct message will appear, but if the in</w:t>
-      </w:r>
-      <w:r>
-        <w:t>put is wrong then an</w:t>
-      </w:r>
-      <w:r>
-        <w:t xml:space="preserve"> incorrect message will appear alongside the right answer. A score streak will also be displayed if the user gets three answers correct in a row which will end if their steak ends due to an</w:t>
-      </w:r>
-      <w:r>
-        <w:t xml:space="preserve"> incorrect answer.</w:t>
-      </w:r>
-    </w:p>
-    <w:p>
-      <w:pPr>
-        <w:rPr>
-          <w:lang w:val="en-IN"/>
-        </w:rPr>
-      </w:pPr>
-      <w:r>
-        <w:rPr>
-          <w:noProof/>
-        </w:rPr>
-        <w:drawing>
-          <wp:anchor distT="0" distB="0" distL="0" distR="0" simplePos="0" relativeHeight="35" behindDoc="0" locked="0" layoutInCell="0" allowOverlap="1" wp14:anchorId="081DB809" wp14:editId="7729DF0C">
-            <wp:simplePos x="0" y="0"/>
-            <wp:positionH relativeFrom="column">
-              <wp:align>center</wp:align>
-            </wp:positionH>
-            <wp:positionV relativeFrom="paragraph">
-              <wp:posOffset>635</wp:posOffset>
-            </wp:positionV>
-            <wp:extent cx="4492625" cy="2058670"/>
-            <wp:effectExtent l="0" t="0" r="0" b="0"/>
-            <wp:wrapSquare wrapText="largest"/>
-            <wp:docPr id="35" name="Image19"/>
-            <wp:cNvGraphicFramePr>
-              <a:graphicFrameLocks xmlns:a="http://schemas.openxmlformats.org/drawingml/2006/main" noChangeAspect="1"/>
-            </wp:cNvGraphicFramePr>
-            <a:graphic xmlns:a="http://schemas.openxmlformats.org/drawingml/2006/main">
-              <a:graphicData uri="http://schemas.openxmlformats.org/drawingml/2006/picture">
-                <pic:pic xmlns:pic="http://schemas.openxmlformats.org/drawingml/2006/picture">
-                  <pic:nvPicPr>
-                    <pic:cNvPr id="35" name="Image19"/>
-                    <pic:cNvPicPr>
-                      <a:picLocks noChangeAspect="1" noChangeArrowheads="1"/>
-                    </pic:cNvPicPr>
-                  </pic:nvPicPr>
-                  <pic:blipFill>
-                    <a:blip r:embed="rId30"/>
-                    <a:stretch>
-                      <a:fillRect/>
-                    </a:stretch>
-                  </pic:blipFill>
-                  <pic:spPr bwMode="auto">
-                    <a:xfrm>
-                      <a:off x="0" y="0"/>
-                      <a:ext cx="4492625" cy="2058670"/>
-                    </a:xfrm>
-                    <a:prstGeom prst="rect">
-                      <a:avLst/>
-                    </a:prstGeom>
-                  </pic:spPr>
-                </pic:pic>
-              </a:graphicData>
-            </a:graphic>
-          </wp:anchor>
-        </w:drawing>
-      </w:r>
-      <w:r>
-        <w:t xml:space="preserve"> </w:t>
-      </w:r>
-    </w:p>
-    <w:p>
-      <w:pPr>
-        <w:rPr>
-          <w:lang w:val="en-IN"/>
-        </w:rPr>
-      </w:pPr>
-    </w:p>
-    <w:p>
-      <w:pPr>
-        <w:rPr>
-          <w:lang w:val="en-IN"/>
-        </w:rPr>
-      </w:pPr>
-    </w:p>
-    <w:p>
-      <w:pPr>
-        <w:rPr>
-          <w:lang w:val="en-IN"/>
-        </w:rPr>
-      </w:pPr>
-    </w:p>
-    <w:p>
-      <w:pPr>
-        <w:rPr>
-          <w:lang w:val="en-IN"/>
-        </w:rPr>
-      </w:pPr>
-    </w:p>
-    <w:p>
-      <w:pPr>
-        <w:rPr>
-          <w:lang w:val="en-IN"/>
-        </w:rPr>
-      </w:pPr>
-    </w:p>
-    <w:p>
-      <w:pPr>
-        <w:rPr>
-          <w:lang w:val="en-IN"/>
-        </w:rPr>
-      </w:pPr>
-    </w:p>
-    <w:p>
-      <w:pPr>
-        <w:rPr>
-          <w:lang w:val="en-IN"/>
-        </w:rPr>
-      </w:pPr>
-    </w:p>
-    <w:p>
-      <w:pPr>
-        <w:rPr>
-          <w:lang w:val="en-IN"/>
-        </w:rPr>
-      </w:pPr>
-      <w:r>
-        <w:rPr>
-          <w:lang w:val="en-IN"/>
-        </w:rPr>
-        <w:t xml:space="preserve">After the last </w:t>
-      </w:r>
-      <w:r>
-        <w:rPr>
-          <w:lang w:val="en-IN"/>
-        </w:rPr>
-        <w:t>question had been answered</w:t>
-      </w:r>
-      <w:r>
-        <w:rPr>
-          <w:lang w:val="en-IN"/>
-        </w:rPr>
-        <w:t xml:space="preserve"> the </w:t>
-      </w:r>
-      <w:proofErr w:type="gramStart"/>
-      <w:r>
-        <w:rPr>
-          <w:lang w:val="en-IN"/>
-        </w:rPr>
-        <w:t>users</w:t>
-      </w:r>
-      <w:proofErr w:type="gramEnd"/>
-      <w:r>
-        <w:rPr>
-          <w:lang w:val="en-IN"/>
-        </w:rPr>
-        <w:t xml:space="preserve"> results will appear to show how they have performed, with data such as what percentage they received</w:t>
-      </w:r>
-      <w:r>
-        <w:rPr>
-          <w:lang w:val="en-IN"/>
-        </w:rPr>
-        <w:t xml:space="preserve"> so they can reflect</w:t>
-      </w:r>
-      <w:r>
-        <w:rPr>
-          <w:lang w:val="en-IN"/>
-        </w:rPr>
-        <w:t xml:space="preserve"> on their attempt. A summary</w:t>
-      </w:r>
-      <w:r>
-        <w:rPr>
-          <w:lang w:val="en-IN"/>
-        </w:rPr>
-        <w:t xml:space="preserve"> will be shown</w:t>
-      </w:r>
-      <w:r>
-        <w:rPr>
-          <w:lang w:val="en-IN"/>
-        </w:rPr>
-        <w:t xml:space="preserve"> and the user can decide if to play again or go back to t</w:t>
-      </w:r>
-      <w:r>
-        <w:rPr>
-          <w:lang w:val="en-IN"/>
-        </w:rPr>
-        <w:t>he main menu.</w:t>
-      </w:r>
-    </w:p>
-    <w:p>
-      <w:r>
-        <w:rPr>
-          <w:noProof/>
-        </w:rPr>
-        <w:drawing>
-          <wp:anchor distT="0" distB="0" distL="0" distR="0" simplePos="0" relativeHeight="36" behindDoc="0" locked="0" layoutInCell="0" allowOverlap="1" wp14:anchorId="1C5ECEE4" wp14:editId="7C33BA4B">
-            <wp:simplePos x="0" y="0"/>
-            <wp:positionH relativeFrom="column">
-              <wp:align>center</wp:align>
-            </wp:positionH>
-            <wp:positionV relativeFrom="paragraph">
-              <wp:posOffset>635</wp:posOffset>
-            </wp:positionV>
-            <wp:extent cx="3709035" cy="2757805"/>
-            <wp:effectExtent l="0" t="0" r="0" b="0"/>
-            <wp:wrapSquare wrapText="largest"/>
-            <wp:docPr id="36" name="Image20"/>
-            <wp:cNvGraphicFramePr>
-              <a:graphicFrameLocks xmlns:a="http://schemas.openxmlformats.org/drawingml/2006/main" noChangeAspect="1"/>
-            </wp:cNvGraphicFramePr>
-            <a:graphic xmlns:a="http://schemas.openxmlformats.org/drawingml/2006/main">
-              <a:graphicData uri="http://schemas.openxmlformats.org/drawingml/2006/picture">
-                <pic:pic xmlns:pic="http://schemas.openxmlformats.org/drawingml/2006/picture">
-                  <pic:nvPicPr>
-                    <pic:cNvPr id="36" name="Image20"/>
-                    <pic:cNvPicPr>
-                      <a:picLocks noChangeAspect="1" noChangeArrowheads="1"/>
-                    </pic:cNvPicPr>
-                  </pic:nvPicPr>
-                  <pic:blipFill>
-                    <a:blip r:embed="rId31"/>
-                    <a:stretch>
-                      <a:fillRect/>
-                    </a:stretch>
-                  </pic:blipFill>
-                  <pic:spPr bwMode="auto">
-                    <a:xfrm>
-                      <a:off x="0" y="0"/>
-                      <a:ext cx="3709035" cy="2757805"/>
-                    </a:xfrm>
-                    <a:prstGeom prst="rect">
-                      <a:avLst/>
-                    </a:prstGeom>
-                  </pic:spPr>
-                </pic:pic>
-              </a:graphicData>
-            </a:graphic>
-          </wp:anchor>
-        </w:drawing>
-      </w:r>
-    </w:p>
-    <w:p>
-      <w:pPr>
-        <w:rPr>
-          <w:lang w:val="en-IN"/>
-        </w:rPr>
-      </w:pPr>
-    </w:p>
-    <w:p>
-      <w:pPr>
-        <w:rPr>
-          <w:lang w:val="en-IN"/>
-        </w:rPr>
-      </w:pPr>
-    </w:p>
-    <w:p>
-      <w:pPr>
-        <w:rPr>
-          <w:lang w:val="en-IN"/>
-        </w:rPr>
-      </w:pPr>
-    </w:p>
-    <w:p>
-      <w:pPr>
-        <w:rPr>
-          <w:lang w:val="en-IN"/>
-        </w:rPr>
-      </w:pPr>
-    </w:p>
-    <w:p>
-      <w:pPr>
-        <w:rPr>
-          <w:lang w:val="en-IN"/>
-        </w:rPr>
-      </w:pPr>
-    </w:p>
-    <w:p>
-      <w:pPr>
-        <w:rPr>
-          <w:lang w:val="en-IN"/>
-        </w:rPr>
-      </w:pPr>
-    </w:p>
-    <w:p>
-      <w:pPr>
-        <w:rPr>
-          <w:lang w:val="en-IN"/>
-        </w:rPr>
-      </w:pPr>
-    </w:p>
-    <w:p>
-      <w:pPr>
-        <w:rPr>
-          <w:lang w:val="en-IN"/>
-        </w:rPr>
-      </w:pPr>
-    </w:p>
-    <w:p>
-      <w:pPr>
-        <w:rPr>
-          <w:lang w:val="en-IN"/>
-        </w:rPr>
-      </w:pPr>
-    </w:p>
-    <w:p>
-      <w:r>
-        <w:rPr>
-          <w:lang w:val="en-IN"/>
-        </w:rPr>
-        <w:t>This program has been made user friendly with the help of validations and easily</w:t>
-      </w:r>
-      <w:r>
-        <w:rPr>
-          <w:lang w:val="en-IN"/>
-        </w:rPr>
-        <w:t xml:space="preserve"> understandable</w:t>
-      </w:r>
-      <w:r>
-        <w:rPr>
-          <w:lang w:val="en-IN"/>
-        </w:rPr>
-        <w:t xml:space="preserve"> navigation tools. It is also keyboard friendly, meaning</w:t>
-      </w:r>
-      <w:r>
-        <w:rPr>
-          <w:lang w:val="en-IN"/>
-        </w:rPr>
-        <w:t xml:space="preserve"> the user can easily enter their answers from the enter button on their keyboard for example and case sensitive</w:t>
-      </w:r>
-      <w:r>
-        <w:rPr>
-          <w:lang w:val="en-IN"/>
-        </w:rPr>
-        <w:t xml:space="preserve">. </w:t>
-      </w:r>
-    </w:p>
-    <w:p>
-      <w:r>
-        <w:rPr>
-          <w:b/>
-          <w:bCs/>
-          <w:lang w:val="en-IN"/>
-        </w:rPr>
         <w:t>End of User Manual</w:t>
       </w:r>
     </w:p>
     <w:p/>
     <w:sectPr>
-      <w:footerReference w:type="default" r:id="rId32"/>
+      <w:footerReference w:type="default" r:id="rId27"/>
       <w:pgSz w:w="11906" w:h="16838"/>
       <w:pgMar w:top="1440" w:right="1440" w:bottom="1440" w:left="1440" w:header="0" w:footer="708" w:gutter="0"/>
       <w:pgNumType w:start="0"/>
@@ -5060,7 +4084,7 @@
 </file>
 
 <file path=word/endnotes.xml><?xml version="1.0" encoding="utf-8"?>
-<w:endnotes xmlns:wpc="http://schemas.microsoft.com/office/word/2010/wordprocessingCanvas" xmlns:cx="http://schemas.microsoft.com/office/drawing/2014/chartex" xmlns:cx1="http://schemas.microsoft.com/office/drawing/2015/9/8/chartex" xmlns:cx2="http://schemas.microsoft.com/office/drawing/2015/10/21/chartex" xmlns:cx3="http://schemas.microsoft.com/office/drawing/2016/5/9/chartex" xmlns:cx4="http://schemas.microsoft.com/office/drawing/2016/5/10/chartex" xmlns:cx5="http://schemas.microsoft.com/office/drawing/2016/5/11/chartex" xmlns:cx6="http://schemas.microsoft.com/office/drawing/2016/5/12/chartex" xmlns:cx7="http://schemas.microsoft.com/office/drawing/2016/5/13/chartex" xmlns:cx8="http://schemas.microsoft.com/office/drawing/2016/5/14/chartex" xmlns:mc="http://schemas.openxmlformats.org/markup-compatibility/2006" xmlns:aink="http://schemas.microsoft.com/office/drawing/2016/ink" xmlns:am3d="http://schemas.microsoft.com/office/drawing/2017/model3d" xmlns:o="urn:schemas-microsoft-com:office:office" xmlns:r="http://schemas.openxmlformats.org/officeDocument/2006/relationships" xmlns:m="http://schemas.openxmlformats.org/officeDocument/2006/math" xmlns:v="urn:schemas-microsoft-com:vml" xmlns:wp14="http://schemas.microsoft.com/office/word/2010/wordprocessingDrawing" xmlns:wp="http://schemas.openxmlformats.org/drawingml/2006/wordprocessingDrawing" xmlns:w10="urn:schemas-microsoft-com:office:word" xmlns:w="http://schemas.openxmlformats.org/wordprocessingml/2006/main" xmlns:w14="http://schemas.microsoft.com/office/word/2010/wordml" xmlns:w15="http://schemas.microsoft.com/office/word/2012/wordml" xmlns:w16cex="http://schemas.microsoft.com/office/word/2018/wordml/cex" xmlns:w16cid="http://schemas.microsoft.com/office/word/2016/wordml/cid" xmlns:w16="http://schemas.microsoft.com/office/word/2018/wordml" xmlns:w16sdtdh="http://schemas.microsoft.com/office/word/2020/wordml/sdtdatahash" xmlns:w16se="http://schemas.microsoft.com/office/word/2015/wordml/symex" xmlns:wpg="http://schemas.microsoft.com/office/word/2010/wordprocessingGroup" xmlns:wpi="http://schemas.microsoft.com/office/word/2010/wordprocessingInk" xmlns:wne="http://schemas.microsoft.com/office/word/2006/wordml" xmlns:wps="http://schemas.microsoft.com/office/word/2010/wordprocessingShape" mc:Ignorable="w14 w15 w16se w16cid w16 w16cex w16sdtdh wp14">
+<w:endnotes xmlns:wpc="http://schemas.microsoft.com/office/word/2010/wordprocessingCanvas" xmlns:cx="http://schemas.microsoft.com/office/drawing/2014/chartex" xmlns:cx1="http://schemas.microsoft.com/office/drawing/2015/9/8/chartex" xmlns:cx2="http://schemas.microsoft.com/office/drawing/2015/10/21/chartex" xmlns:cx3="http://schemas.microsoft.com/office/drawing/2016/5/9/chartex" xmlns:cx4="http://schemas.microsoft.com/office/drawing/2016/5/10/chartex" xmlns:cx5="http://schemas.microsoft.com/office/drawing/2016/5/11/chartex" xmlns:cx6="http://schemas.microsoft.com/office/drawing/2016/5/12/chartex" xmlns:cx7="http://schemas.microsoft.com/office/drawing/2016/5/13/chartex" xmlns:cx8="http://schemas.microsoft.com/office/drawing/2016/5/14/chartex" xmlns:mc="http://schemas.openxmlformats.org/markup-compatibility/2006" xmlns:aink="http://schemas.microsoft.com/office/drawing/2016/ink" xmlns:am3d="http://schemas.microsoft.com/office/drawing/2017/model3d" xmlns:o="urn:schemas-microsoft-com:office:office" xmlns:oel="http://schemas.microsoft.com/office/2019/extlst" xmlns:r="http://schemas.openxmlformats.org/officeDocument/2006/relationships" xmlns:m="http://schemas.openxmlformats.org/officeDocument/2006/math" xmlns:v="urn:schemas-microsoft-com:vml" xmlns:wp14="http://schemas.microsoft.com/office/word/2010/wordprocessingDrawing" xmlns:wp="http://schemas.openxmlformats.org/drawingml/2006/wordprocessingDrawing" xmlns:w10="urn:schemas-microsoft-com:office:word" xmlns:w="http://schemas.openxmlformats.org/wordprocessingml/2006/main" xmlns:w14="http://schemas.microsoft.com/office/word/2010/wordml" xmlns:w15="http://schemas.microsoft.com/office/word/2012/wordml" xmlns:w16cex="http://schemas.microsoft.com/office/word/2018/wordml/cex" xmlns:w16cid="http://schemas.microsoft.com/office/word/2016/wordml/cid" xmlns:w16="http://schemas.microsoft.com/office/word/2018/wordml" xmlns:w16du="http://schemas.microsoft.com/office/word/2023/wordml/word16du" xmlns:w16sdtdh="http://schemas.microsoft.com/office/word/2020/wordml/sdtdatahash" xmlns:w16sdtfl="http://schemas.microsoft.com/office/word/2024/wordml/sdtformatlock" xmlns:w16se="http://schemas.microsoft.com/office/word/2015/wordml/symex" xmlns:wpg="http://schemas.microsoft.com/office/word/2010/wordprocessingGroup" xmlns:wpi="http://schemas.microsoft.com/office/word/2010/wordprocessingInk" xmlns:wne="http://schemas.microsoft.com/office/word/2006/wordml" xmlns:wps="http://schemas.microsoft.com/office/word/2010/wordprocessingShape" mc:Ignorable="w14 w15 w16se w16cid w16 w16cex w16sdtdh w16sdtfl w16du wp14">
   <w:endnote w:type="separator" w:id="-1">
     <w:p>
       <w:pPr>
@@ -5085,7 +4109,7 @@
 </file>
 
 <file path=word/footer1.xml><?xml version="1.0" encoding="utf-8"?>
-<w:ftr xmlns:wpc="http://schemas.microsoft.com/office/word/2010/wordprocessingCanvas" xmlns:cx="http://schemas.microsoft.com/office/drawing/2014/chartex" xmlns:cx1="http://schemas.microsoft.com/office/drawing/2015/9/8/chartex" xmlns:cx2="http://schemas.microsoft.com/office/drawing/2015/10/21/chartex" xmlns:cx3="http://schemas.microsoft.com/office/drawing/2016/5/9/chartex" xmlns:cx4="http://schemas.microsoft.com/office/drawing/2016/5/10/chartex" xmlns:cx5="http://schemas.microsoft.com/office/drawing/2016/5/11/chartex" xmlns:cx6="http://schemas.microsoft.com/office/drawing/2016/5/12/chartex" xmlns:cx7="http://schemas.microsoft.com/office/drawing/2016/5/13/chartex" xmlns:cx8="http://schemas.microsoft.com/office/drawing/2016/5/14/chartex" xmlns:mc="http://schemas.openxmlformats.org/markup-compatibility/2006" xmlns:aink="http://schemas.microsoft.com/office/drawing/2016/ink" xmlns:am3d="http://schemas.microsoft.com/office/drawing/2017/model3d" xmlns:o="urn:schemas-microsoft-com:office:office" xmlns:r="http://schemas.openxmlformats.org/officeDocument/2006/relationships" xmlns:m="http://schemas.openxmlformats.org/officeDocument/2006/math" xmlns:v="urn:schemas-microsoft-com:vml" xmlns:wp14="http://schemas.microsoft.com/office/word/2010/wordprocessingDrawing" xmlns:wp="http://schemas.openxmlformats.org/drawingml/2006/wordprocessingDrawing" xmlns:w10="urn:schemas-microsoft-com:office:word" xmlns:w="http://schemas.openxmlformats.org/wordprocessingml/2006/main" xmlns:w14="http://schemas.microsoft.com/office/word/2010/wordml" xmlns:w15="http://schemas.microsoft.com/office/word/2012/wordml" xmlns:w16cex="http://schemas.microsoft.com/office/word/2018/wordml/cex" xmlns:w16cid="http://schemas.microsoft.com/office/word/2016/wordml/cid" xmlns:w16="http://schemas.microsoft.com/office/word/2018/wordml" xmlns:w16sdtdh="http://schemas.microsoft.com/office/word/2020/wordml/sdtdatahash" xmlns:w16se="http://schemas.microsoft.com/office/word/2015/wordml/symex" xmlns:wpg="http://schemas.microsoft.com/office/word/2010/wordprocessingGroup" xmlns:wpi="http://schemas.microsoft.com/office/word/2010/wordprocessingInk" xmlns:wne="http://schemas.microsoft.com/office/word/2006/wordml" xmlns:wps="http://schemas.microsoft.com/office/word/2010/wordprocessingShape" mc:Ignorable="w14 w15 w16se w16cid w16 w16cex w16sdtdh wp14">
+<w:ftr xmlns:wpc="http://schemas.microsoft.com/office/word/2010/wordprocessingCanvas" xmlns:cx="http://schemas.microsoft.com/office/drawing/2014/chartex" xmlns:cx1="http://schemas.microsoft.com/office/drawing/2015/9/8/chartex" xmlns:cx2="http://schemas.microsoft.com/office/drawing/2015/10/21/chartex" xmlns:cx3="http://schemas.microsoft.com/office/drawing/2016/5/9/chartex" xmlns:cx4="http://schemas.microsoft.com/office/drawing/2016/5/10/chartex" xmlns:cx5="http://schemas.microsoft.com/office/drawing/2016/5/11/chartex" xmlns:cx6="http://schemas.microsoft.com/office/drawing/2016/5/12/chartex" xmlns:cx7="http://schemas.microsoft.com/office/drawing/2016/5/13/chartex" xmlns:cx8="http://schemas.microsoft.com/office/drawing/2016/5/14/chartex" xmlns:mc="http://schemas.openxmlformats.org/markup-compatibility/2006" xmlns:aink="http://schemas.microsoft.com/office/drawing/2016/ink" xmlns:am3d="http://schemas.microsoft.com/office/drawing/2017/model3d" xmlns:o="urn:schemas-microsoft-com:office:office" xmlns:oel="http://schemas.microsoft.com/office/2019/extlst" xmlns:r="http://schemas.openxmlformats.org/officeDocument/2006/relationships" xmlns:m="http://schemas.openxmlformats.org/officeDocument/2006/math" xmlns:v="urn:schemas-microsoft-com:vml" xmlns:wp14="http://schemas.microsoft.com/office/word/2010/wordprocessingDrawing" xmlns:wp="http://schemas.openxmlformats.org/drawingml/2006/wordprocessingDrawing" xmlns:w10="urn:schemas-microsoft-com:office:word" xmlns:w="http://schemas.openxmlformats.org/wordprocessingml/2006/main" xmlns:w14="http://schemas.microsoft.com/office/word/2010/wordml" xmlns:w15="http://schemas.microsoft.com/office/word/2012/wordml" xmlns:w16cex="http://schemas.microsoft.com/office/word/2018/wordml/cex" xmlns:w16cid="http://schemas.microsoft.com/office/word/2016/wordml/cid" xmlns:w16="http://schemas.microsoft.com/office/word/2018/wordml" xmlns:w16du="http://schemas.microsoft.com/office/word/2023/wordml/word16du" xmlns:w16sdtdh="http://schemas.microsoft.com/office/word/2020/wordml/sdtdatahash" xmlns:w16sdtfl="http://schemas.microsoft.com/office/word/2024/wordml/sdtformatlock" xmlns:w16se="http://schemas.microsoft.com/office/word/2015/wordml/symex" xmlns:wpg="http://schemas.microsoft.com/office/word/2010/wordprocessingGroup" xmlns:wpi="http://schemas.microsoft.com/office/word/2010/wordprocessingInk" xmlns:wne="http://schemas.microsoft.com/office/word/2006/wordml" xmlns:wps="http://schemas.microsoft.com/office/word/2010/wordprocessingShape" mc:Ignorable="w14 w15 w16se w16cid w16 w16cex w16sdtdh w16sdtfl w16du wp14">
   <w:sdt>
     <w:sdtPr>
       <w:id w:val="1021804874"/>
@@ -5094,7 +4118,6 @@
         <w:docPartUnique/>
       </w:docPartObj>
     </w:sdtPr>
-    <w:sdtEndPr/>
     <w:sdtContent>
       <w:p>
         <w:pPr>
@@ -5128,7 +4151,7 @@
 </file>
 
 <file path=word/footnotes.xml><?xml version="1.0" encoding="utf-8"?>
-<w:footnotes xmlns:wpc="http://schemas.microsoft.com/office/word/2010/wordprocessingCanvas" xmlns:cx="http://schemas.microsoft.com/office/drawing/2014/chartex" xmlns:cx1="http://schemas.microsoft.com/office/drawing/2015/9/8/chartex" xmlns:cx2="http://schemas.microsoft.com/office/drawing/2015/10/21/chartex" xmlns:cx3="http://schemas.microsoft.com/office/drawing/2016/5/9/chartex" xmlns:cx4="http://schemas.microsoft.com/office/drawing/2016/5/10/chartex" xmlns:cx5="http://schemas.microsoft.com/office/drawing/2016/5/11/chartex" xmlns:cx6="http://schemas.microsoft.com/office/drawing/2016/5/12/chartex" xmlns:cx7="http://schemas.microsoft.com/office/drawing/2016/5/13/chartex" xmlns:cx8="http://schemas.microsoft.com/office/drawing/2016/5/14/chartex" xmlns:mc="http://schemas.openxmlformats.org/markup-compatibility/2006" xmlns:aink="http://schemas.microsoft.com/office/drawing/2016/ink" xmlns:am3d="http://schemas.microsoft.com/office/drawing/2017/model3d" xmlns:o="urn:schemas-microsoft-com:office:office" xmlns:r="http://schemas.openxmlformats.org/officeDocument/2006/relationships" xmlns:m="http://schemas.openxmlformats.org/officeDocument/2006/math" xmlns:v="urn:schemas-microsoft-com:vml" xmlns:wp14="http://schemas.microsoft.com/office/word/2010/wordprocessingDrawing" xmlns:wp="http://schemas.openxmlformats.org/drawingml/2006/wordprocessingDrawing" xmlns:w10="urn:schemas-microsoft-com:office:word" xmlns:w="http://schemas.openxmlformats.org/wordprocessingml/2006/main" xmlns:w14="http://schemas.microsoft.com/office/word/2010/wordml" xmlns:w15="http://schemas.microsoft.com/office/word/2012/wordml" xmlns:w16cex="http://schemas.microsoft.com/office/word/2018/wordml/cex" xmlns:w16cid="http://schemas.microsoft.com/office/word/2016/wordml/cid" xmlns:w16="http://schemas.microsoft.com/office/word/2018/wordml" xmlns:w16sdtdh="http://schemas.microsoft.com/office/word/2020/wordml/sdtdatahash" xmlns:w16se="http://schemas.microsoft.com/office/word/2015/wordml/symex" xmlns:wpg="http://schemas.microsoft.com/office/word/2010/wordprocessingGroup" xmlns:wpi="http://schemas.microsoft.com/office/word/2010/wordprocessingInk" xmlns:wne="http://schemas.microsoft.com/office/word/2006/wordml" xmlns:wps="http://schemas.microsoft.com/office/word/2010/wordprocessingShape" mc:Ignorable="w14 w15 w16se w16cid w16 w16cex w16sdtdh wp14">
+<w:footnotes xmlns:wpc="http://schemas.microsoft.com/office/word/2010/wordprocessingCanvas" xmlns:cx="http://schemas.microsoft.com/office/drawing/2014/chartex" xmlns:cx1="http://schemas.microsoft.com/office/drawing/2015/9/8/chartex" xmlns:cx2="http://schemas.microsoft.com/office/drawing/2015/10/21/chartex" xmlns:cx3="http://schemas.microsoft.com/office/drawing/2016/5/9/chartex" xmlns:cx4="http://schemas.microsoft.com/office/drawing/2016/5/10/chartex" xmlns:cx5="http://schemas.microsoft.com/office/drawing/2016/5/11/chartex" xmlns:cx6="http://schemas.microsoft.com/office/drawing/2016/5/12/chartex" xmlns:cx7="http://schemas.microsoft.com/office/drawing/2016/5/13/chartex" xmlns:cx8="http://schemas.microsoft.com/office/drawing/2016/5/14/chartex" xmlns:mc="http://schemas.openxmlformats.org/markup-compatibility/2006" xmlns:aink="http://schemas.microsoft.com/office/drawing/2016/ink" xmlns:am3d="http://schemas.microsoft.com/office/drawing/2017/model3d" xmlns:o="urn:schemas-microsoft-com:office:office" xmlns:oel="http://schemas.microsoft.com/office/2019/extlst" xmlns:r="http://schemas.openxmlformats.org/officeDocument/2006/relationships" xmlns:m="http://schemas.openxmlformats.org/officeDocument/2006/math" xmlns:v="urn:schemas-microsoft-com:vml" xmlns:wp14="http://schemas.microsoft.com/office/word/2010/wordprocessingDrawing" xmlns:wp="http://schemas.openxmlformats.org/drawingml/2006/wordprocessingDrawing" xmlns:w10="urn:schemas-microsoft-com:office:word" xmlns:w="http://schemas.openxmlformats.org/wordprocessingml/2006/main" xmlns:w14="http://schemas.microsoft.com/office/word/2010/wordml" xmlns:w15="http://schemas.microsoft.com/office/word/2012/wordml" xmlns:w16cex="http://schemas.microsoft.com/office/word/2018/wordml/cex" xmlns:w16cid="http://schemas.microsoft.com/office/word/2016/wordml/cid" xmlns:w16="http://schemas.microsoft.com/office/word/2018/wordml" xmlns:w16du="http://schemas.microsoft.com/office/word/2023/wordml/word16du" xmlns:w16sdtdh="http://schemas.microsoft.com/office/word/2020/wordml/sdtdatahash" xmlns:w16sdtfl="http://schemas.microsoft.com/office/word/2024/wordml/sdtformatlock" xmlns:w16se="http://schemas.microsoft.com/office/word/2015/wordml/symex" xmlns:wpg="http://schemas.microsoft.com/office/word/2010/wordprocessingGroup" xmlns:wpi="http://schemas.microsoft.com/office/word/2010/wordprocessingInk" xmlns:wne="http://schemas.microsoft.com/office/word/2006/wordml" xmlns:wps="http://schemas.microsoft.com/office/word/2010/wordprocessingShape" mc:Ignorable="w14 w15 w16se w16cid w16 w16cex w16sdtdh w16sdtfl w16du wp14">
   <w:footnote w:type="separator" w:id="-1">
     <w:p>
       <w:pPr>
@@ -5153,7 +4176,7 @@
 </file>
 
 <file path=word/numbering.xml><?xml version="1.0" encoding="utf-8"?>
-<w:numbering xmlns:wpc="http://schemas.microsoft.com/office/word/2010/wordprocessingCanvas" xmlns:cx="http://schemas.microsoft.com/office/drawing/2014/chartex" xmlns:cx1="http://schemas.microsoft.com/office/drawing/2015/9/8/chartex" xmlns:cx2="http://schemas.microsoft.com/office/drawing/2015/10/21/chartex" xmlns:cx3="http://schemas.microsoft.com/office/drawing/2016/5/9/chartex" xmlns:cx4="http://schemas.microsoft.com/office/drawing/2016/5/10/chartex" xmlns:cx5="http://schemas.microsoft.com/office/drawing/2016/5/11/chartex" xmlns:cx6="http://schemas.microsoft.com/office/drawing/2016/5/12/chartex" xmlns:cx7="http://schemas.microsoft.com/office/drawing/2016/5/13/chartex" xmlns:cx8="http://schemas.microsoft.com/office/drawing/2016/5/14/chartex" xmlns:mc="http://schemas.openxmlformats.org/markup-compatibility/2006" xmlns:aink="http://schemas.microsoft.com/office/drawing/2016/ink" xmlns:am3d="http://schemas.microsoft.com/office/drawing/2017/model3d" xmlns:o="urn:schemas-microsoft-com:office:office" xmlns:r="http://schemas.openxmlformats.org/officeDocument/2006/relationships" xmlns:m="http://schemas.openxmlformats.org/officeDocument/2006/math" xmlns:v="urn:schemas-microsoft-com:vml" xmlns:wp14="http://schemas.microsoft.com/office/word/2010/wordprocessingDrawing" xmlns:wp="http://schemas.openxmlformats.org/drawingml/2006/wordprocessingDrawing" xmlns:w10="urn:schemas-microsoft-com:office:word" xmlns:w="http://schemas.openxmlformats.org/wordprocessingml/2006/main" xmlns:w14="http://schemas.microsoft.com/office/word/2010/wordml" xmlns:w15="http://schemas.microsoft.com/office/word/2012/wordml" xmlns:w16cex="http://schemas.microsoft.com/office/word/2018/wordml/cex" xmlns:w16cid="http://schemas.microsoft.com/office/word/2016/wordml/cid" xmlns:w16="http://schemas.microsoft.com/office/word/2018/wordml" xmlns:w16sdtdh="http://schemas.microsoft.com/office/word/2020/wordml/sdtdatahash" xmlns:w16se="http://schemas.microsoft.com/office/word/2015/wordml/symex" xmlns:wpg="http://schemas.microsoft.com/office/word/2010/wordprocessingGroup" xmlns:wpi="http://schemas.microsoft.com/office/word/2010/wordprocessingInk" xmlns:wne="http://schemas.microsoft.com/office/word/2006/wordml" xmlns:wps="http://schemas.microsoft.com/office/word/2010/wordprocessingShape" mc:Ignorable="w14 w15 w16se w16cid w16 w16cex w16sdtdh wp14">
+<w:numbering xmlns:wpc="http://schemas.microsoft.com/office/word/2010/wordprocessingCanvas" xmlns:cx="http://schemas.microsoft.com/office/drawing/2014/chartex" xmlns:cx1="http://schemas.microsoft.com/office/drawing/2015/9/8/chartex" xmlns:cx2="http://schemas.microsoft.com/office/drawing/2015/10/21/chartex" xmlns:cx3="http://schemas.microsoft.com/office/drawing/2016/5/9/chartex" xmlns:cx4="http://schemas.microsoft.com/office/drawing/2016/5/10/chartex" xmlns:cx5="http://schemas.microsoft.com/office/drawing/2016/5/11/chartex" xmlns:cx6="http://schemas.microsoft.com/office/drawing/2016/5/12/chartex" xmlns:cx7="http://schemas.microsoft.com/office/drawing/2016/5/13/chartex" xmlns:cx8="http://schemas.microsoft.com/office/drawing/2016/5/14/chartex" xmlns:mc="http://schemas.openxmlformats.org/markup-compatibility/2006" xmlns:aink="http://schemas.microsoft.com/office/drawing/2016/ink" xmlns:am3d="http://schemas.microsoft.com/office/drawing/2017/model3d" xmlns:o="urn:schemas-microsoft-com:office:office" xmlns:oel="http://schemas.microsoft.com/office/2019/extlst" xmlns:r="http://schemas.openxmlformats.org/officeDocument/2006/relationships" xmlns:m="http://schemas.openxmlformats.org/officeDocument/2006/math" xmlns:v="urn:schemas-microsoft-com:vml" xmlns:wp14="http://schemas.microsoft.com/office/word/2010/wordprocessingDrawing" xmlns:wp="http://schemas.openxmlformats.org/drawingml/2006/wordprocessingDrawing" xmlns:w10="urn:schemas-microsoft-com:office:word" xmlns:w="http://schemas.openxmlformats.org/wordprocessingml/2006/main" xmlns:w14="http://schemas.microsoft.com/office/word/2010/wordml" xmlns:w15="http://schemas.microsoft.com/office/word/2012/wordml" xmlns:w16cex="http://schemas.microsoft.com/office/word/2018/wordml/cex" xmlns:w16cid="http://schemas.microsoft.com/office/word/2016/wordml/cid" xmlns:w16="http://schemas.microsoft.com/office/word/2018/wordml" xmlns:w16du="http://schemas.microsoft.com/office/word/2023/wordml/word16du" xmlns:w16sdtdh="http://schemas.microsoft.com/office/word/2020/wordml/sdtdatahash" xmlns:w16sdtfl="http://schemas.microsoft.com/office/word/2024/wordml/sdtformatlock" xmlns:w16se="http://schemas.microsoft.com/office/word/2015/wordml/symex" xmlns:wpg="http://schemas.microsoft.com/office/word/2010/wordprocessingGroup" xmlns:wpi="http://schemas.microsoft.com/office/word/2010/wordprocessingInk" xmlns:wne="http://schemas.microsoft.com/office/word/2006/wordml" xmlns:wps="http://schemas.microsoft.com/office/word/2010/wordprocessingShape" mc:Ignorable="w14 w15 w16se w16cid w16 w16cex w16sdtdh w16sdtfl w16du wp14">
   <w:abstractNum w:abstractNumId="0" w15:restartNumberingAfterBreak="0">
     <w:nsid w:val="03190847"/>
     <w:multiLevelType w:val="multilevel"/>
@@ -6071,35 +5094,35 @@
       </w:pPr>
     </w:lvl>
   </w:abstractNum>
-  <w:num w:numId="1">
+  <w:num w:numId="1" w16cid:durableId="1975984460">
     <w:abstractNumId w:val="0"/>
   </w:num>
-  <w:num w:numId="2">
+  <w:num w:numId="2" w16cid:durableId="383255179">
     <w:abstractNumId w:val="5"/>
   </w:num>
-  <w:num w:numId="3">
+  <w:num w:numId="3" w16cid:durableId="476411317">
     <w:abstractNumId w:val="4"/>
   </w:num>
-  <w:num w:numId="4">
+  <w:num w:numId="4" w16cid:durableId="2005737834">
     <w:abstractNumId w:val="2"/>
   </w:num>
-  <w:num w:numId="5">
+  <w:num w:numId="5" w16cid:durableId="2127039953">
     <w:abstractNumId w:val="7"/>
   </w:num>
-  <w:num w:numId="6">
+  <w:num w:numId="6" w16cid:durableId="1223835344">
     <w:abstractNumId w:val="6"/>
   </w:num>
-  <w:num w:numId="7">
+  <w:num w:numId="7" w16cid:durableId="1649624896">
     <w:abstractNumId w:val="3"/>
   </w:num>
-  <w:num w:numId="8">
+  <w:num w:numId="8" w16cid:durableId="332684142">
     <w:abstractNumId w:val="1"/>
   </w:num>
 </w:numbering>
 </file>
 
 <file path=word/styles.xml><?xml version="1.0" encoding="utf-8"?>
-<w:styles xmlns:mc="http://schemas.openxmlformats.org/markup-compatibility/2006" xmlns:r="http://schemas.openxmlformats.org/officeDocument/2006/relationships" xmlns:w="http://schemas.openxmlformats.org/wordprocessingml/2006/main" xmlns:w14="http://schemas.microsoft.com/office/word/2010/wordml" xmlns:w15="http://schemas.microsoft.com/office/word/2012/wordml" xmlns:w16cex="http://schemas.microsoft.com/office/word/2018/wordml/cex" xmlns:w16cid="http://schemas.microsoft.com/office/word/2016/wordml/cid" xmlns:w16="http://schemas.microsoft.com/office/word/2018/wordml" xmlns:w16sdtdh="http://schemas.microsoft.com/office/word/2020/wordml/sdtdatahash" xmlns:w16se="http://schemas.microsoft.com/office/word/2015/wordml/symex" mc:Ignorable="w14 w15 w16se w16cid w16 w16cex w16sdtdh">
+<w:styles xmlns:mc="http://schemas.openxmlformats.org/markup-compatibility/2006" xmlns:r="http://schemas.openxmlformats.org/officeDocument/2006/relationships" xmlns:w="http://schemas.openxmlformats.org/wordprocessingml/2006/main" xmlns:w14="http://schemas.microsoft.com/office/word/2010/wordml" xmlns:w15="http://schemas.microsoft.com/office/word/2012/wordml" xmlns:w16cex="http://schemas.microsoft.com/office/word/2018/wordml/cex" xmlns:w16cid="http://schemas.microsoft.com/office/word/2016/wordml/cid" xmlns:w16="http://schemas.microsoft.com/office/word/2018/wordml" xmlns:w16du="http://schemas.microsoft.com/office/word/2023/wordml/word16du" xmlns:w16sdtdh="http://schemas.microsoft.com/office/word/2020/wordml/sdtdatahash" xmlns:w16sdtfl="http://schemas.microsoft.com/office/word/2024/wordml/sdtformatlock" xmlns:w16se="http://schemas.microsoft.com/office/word/2015/wordml/symex" mc:Ignorable="w14 w15 w16se w16cid w16 w16cex w16sdtdh w16sdtfl w16du">
   <w:docDefaults>
     <w:rPrDefault>
       <w:rPr>

</xml_diff>

<commit_message>
Updated User-Manual(1) - Removed Flashcards from Contents
</commit_message>
<xml_diff>
--- a/User manual/User-manual(1).docx
+++ b/User manual/User-manual(1).docx
@@ -131,7 +131,7 @@
           </mc:Choice>
           <mc:Fallback>
             <w:pict>
-              <v:rect w14:anchorId="5710A4EA" id="Text Box 163" o:spid="_x0000_s1026" style="position:absolute;margin-left:0;margin-top:252.55pt;width:571.7pt;height:307.75pt;z-index:19;visibility:visible;mso-wrap-style:square;mso-width-percent:940;mso-height-percent:360;mso-wrap-distance-left:9pt;mso-wrap-distance-top:0;mso-wrap-distance-right:9pt;mso-wrap-distance-bottom:.45pt;mso-position-horizontal:center;mso-position-horizontal-relative:page;mso-position-vertical:absolute;mso-position-vertical-relative:page;mso-width-percent:940;mso-height-percent:360;mso-width-relative:page;mso-height-relative:page;v-text-anchor:bottom" o:gfxdata="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" o:allowincell="f" filled="f" stroked="f" strokeweight=".5pt">
+              <v:rect w14:anchorId="5710A4EA" id="Text Box 163" o:spid="_x0000_s1026" style="position:absolute;margin-left:0;margin-top:252.55pt;width:571.7pt;height:307.75pt;z-index:19;visibility:visible;mso-wrap-style:square;mso-width-percent:940;mso-height-percent:360;mso-wrap-distance-left:9pt;mso-wrap-distance-top:0;mso-wrap-distance-right:9pt;mso-wrap-distance-bottom:.45pt;mso-position-horizontal:center;mso-position-horizontal-relative:page;mso-position-vertical:absolute;mso-position-vertical-relative:page;mso-width-percent:940;mso-height-percent:360;mso-width-relative:page;mso-height-relative:page;v-text-anchor:bottom" o:gfxdata="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" o:allowincell="f" filled="f" stroked="f" strokeweight=".5pt">
                 <v:textbox inset="126pt,0,54pt,0">
                   <w:txbxContent>
                     <w:p>
@@ -151,7 +151,6 @@
                           <w:dataBinding w:prefixMappings="xmlns:ns0='http://purl.org/dc/elements/1.1/' xmlns:ns1='http://schemas.openxmlformats.org/package/2006/metadata/core-properties' " w:xpath="/ns1:coreProperties[1]/ns0:title[1]" w:storeItemID="{6C3C8BC8-F283-45AE-878A-BAB7291924A1}"/>
                           <w:text w:multiLine="1"/>
                         </w:sdtPr>
-                        <w:sdtEndPr/>
                         <w:sdtContent>
                           <w:r>
                             <w:rPr>
@@ -180,7 +179,6 @@
                           <w:dataBinding w:prefixMappings="xmlns:ns0='http://purl.org/dc/elements/1.1/' xmlns:ns1='http://schemas.openxmlformats.org/package/2006/metadata/core-properties' " w:xpath="/ns1:coreProperties[1]/ns0:subject[1]" w:storeItemID="{6C3C8BC8-F283-45AE-878A-BAB7291924A1}"/>
                           <w:text/>
                         </w:sdtPr>
-                        <w:sdtEndPr/>
                         <w:sdtContent>
                           <w:r>
                             <w:rPr>
@@ -297,7 +295,15 @@
                                   </w:sdtPr>
                                   <w:sdtContent>
                                     <w:r>
-                                      <w:t>Raiyan Alam, Denis Gitman, Neel Patkar, Harman Singh, Namit Singh, Arshdip Singh</w:t>
+                                      <w:t xml:space="preserve">Raiyan Alam, Denis Gitman, Neel Patkar, Harman Singh, Namit Singh, </w:t>
+                                    </w:r>
+                                    <w:proofErr w:type="spellStart"/>
+                                    <w:r>
+                                      <w:t>Arshdip</w:t>
+                                    </w:r>
+                                    <w:proofErr w:type="spellEnd"/>
+                                    <w:r>
+                                      <w:t xml:space="preserve"> Singh</w:t>
                                     </w:r>
                                   </w:sdtContent>
                                 </w:sdt>
@@ -326,7 +332,7 @@
           </mc:Choice>
           <mc:Fallback>
             <w:pict>
-              <v:rect w14:anchorId="1D0273A4" id="Text Box 161" o:spid="_x0000_s1027" style="position:absolute;margin-left:0;margin-top:589.3pt;width:569.1pt;height:41.8pt;z-index:21;visibility:visible;mso-wrap-style:square;mso-width-percent:940;mso-height-percent:100;mso-wrap-distance-left:9pt;mso-wrap-distance-top:0;mso-wrap-distance-right:9pt;mso-wrap-distance-bottom:0;mso-position-horizontal:center;mso-position-horizontal-relative:page;mso-position-vertical:absolute;mso-position-vertical-relative:page;mso-width-percent:940;mso-height-percent:100;mso-width-relative:page;mso-height-relative:page;v-text-anchor:top" o:gfxdata="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" o:allowincell="f" filled="f" stroked="f" strokeweight=".5pt">
+              <v:rect w14:anchorId="1D0273A4" id="Text Box 161" o:spid="_x0000_s1027" style="position:absolute;margin-left:0;margin-top:589.3pt;width:569.1pt;height:41.8pt;z-index:21;visibility:visible;mso-wrap-style:square;mso-width-percent:940;mso-height-percent:100;mso-wrap-distance-left:9pt;mso-wrap-distance-top:0;mso-wrap-distance-right:9pt;mso-wrap-distance-bottom:0;mso-position-horizontal:center;mso-position-horizontal-relative:page;mso-position-vertical:absolute;mso-position-vertical-relative:page;mso-width-percent:940;mso-height-percent:100;mso-width-relative:page;mso-height-relative:page;v-text-anchor:top" o:gfxdata="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" o:allowincell="f" filled="f" stroked="f" strokeweight=".5pt">
                 <v:textbox style="mso-fit-shape-to-text:t" inset="126pt,0,54pt,0">
                   <w:txbxContent>
                     <w:sdt>
@@ -337,7 +343,6 @@
                           <w:docPartUnique/>
                         </w:docPartObj>
                       </w:sdtPr>
-                      <w:sdtEndPr/>
                       <w:sdtContent>
                         <w:p>
                           <w:pPr>
@@ -375,39 +380,17 @@
                               <w:dataBinding w:prefixMappings="xmlns:ns0='http://schemas.microsoft.com/office/2006/coverPageProps' " w:xpath="/ns0:CoverPageProperties[1]/ns0:Abstract[1]" w:storeItemID="{55AF091B-3C7A-41E3-B477-F2FDAA23CFDA}"/>
                               <w:text w:multiLine="1"/>
                             </w:sdtPr>
-                            <w:sdtEndPr/>
                             <w:sdtContent>
+                              <w:r>
+                                <w:t xml:space="preserve">Raiyan Alam, Denis Gitman, Neel Patkar, Harman Singh, Namit Singh, </w:t>
+                              </w:r>
                               <w:proofErr w:type="spellStart"/>
                               <w:r>
-                                <w:t>Raiyan</w:t>
+                                <w:t>Arshdip</w:t>
                               </w:r>
                               <w:proofErr w:type="spellEnd"/>
                               <w:r>
-                                <w:t xml:space="preserve"> </w:t>
-                              </w:r>
-                              <w:proofErr w:type="spellStart"/>
-                              <w:r>
-                                <w:t>Alam</w:t>
-                              </w:r>
-                              <w:proofErr w:type="spellEnd"/>
-                              <w:r>
-                                <w:t xml:space="preserve">, Denis </w:t>
-                              </w:r>
-                              <w:proofErr w:type="spellStart"/>
-                              <w:r>
-                                <w:t>Gitman</w:t>
-                              </w:r>
-                              <w:proofErr w:type="spellEnd"/>
-                              <w:r>
-                                <w:t xml:space="preserve">, Neel Patkar, Harman Singh, </w:t>
-                              </w:r>
-                              <w:proofErr w:type="spellStart"/>
-                              <w:r>
-                                <w:t>Namit</w:t>
-                              </w:r>
-                              <w:proofErr w:type="spellEnd"/>
-                              <w:r>
-                                <w:t xml:space="preserve"> Singh, Arshdip Singh</w:t>
+                                <w:t xml:space="preserve"> Singh</w:t>
                               </w:r>
                             </w:sdtContent>
                           </w:sdt>
@@ -624,9 +607,9 @@
             <w:rPr>
               <w:rFonts w:eastAsiaTheme="minorEastAsia"/>
               <w:noProof/>
-              <w:kern w:val="0"/>
+              <w:sz w:val="24"/>
+              <w:szCs w:val="24"/>
               <w:lang w:eastAsia="en-GB"/>
-              <w14:ligatures w14:val="none"/>
             </w:rPr>
           </w:pPr>
           <w:r>
@@ -647,7 +630,7 @@
             </w:rPr>
             <w:fldChar w:fldCharType="separate"/>
           </w:r>
-          <w:hyperlink w:anchor="_Toc193295087" w:history="1">
+          <w:hyperlink w:anchor="_Toc193815406" w:history="1">
             <w:r>
               <w:rPr>
                 <w:rStyle w:val="Hyperlink"/>
@@ -675,7 +658,7 @@
                 <w:noProof/>
                 <w:webHidden/>
               </w:rPr>
-              <w:instrText xml:space="preserve"> PAGEREF _Toc193295087 \h </w:instrText>
+              <w:instrText xml:space="preserve"> PAGEREF _Toc193815406 \h </w:instrText>
             </w:r>
             <w:r>
               <w:rPr>
@@ -715,12 +698,12 @@
             <w:rPr>
               <w:rFonts w:eastAsiaTheme="minorEastAsia"/>
               <w:noProof/>
-              <w:kern w:val="0"/>
+              <w:sz w:val="24"/>
+              <w:szCs w:val="24"/>
               <w:lang w:eastAsia="en-GB"/>
-              <w14:ligatures w14:val="none"/>
             </w:rPr>
           </w:pPr>
-          <w:hyperlink w:anchor="_Toc193295088" w:history="1">
+          <w:hyperlink w:anchor="_Toc193815407" w:history="1">
             <w:r>
               <w:rPr>
                 <w:rStyle w:val="Hyperlink"/>
@@ -748,7 +731,7 @@
                 <w:noProof/>
                 <w:webHidden/>
               </w:rPr>
-              <w:instrText xml:space="preserve"> PAGEREF _Toc193295088 \h </w:instrText>
+              <w:instrText xml:space="preserve"> PAGEREF _Toc193815407 \h </w:instrText>
             </w:r>
             <w:r>
               <w:rPr>
@@ -788,12 +771,12 @@
             <w:rPr>
               <w:rFonts w:eastAsiaTheme="minorEastAsia"/>
               <w:noProof/>
-              <w:kern w:val="0"/>
+              <w:sz w:val="24"/>
+              <w:szCs w:val="24"/>
               <w:lang w:eastAsia="en-GB"/>
-              <w14:ligatures w14:val="none"/>
             </w:rPr>
           </w:pPr>
-          <w:hyperlink w:anchor="_Toc193295089" w:history="1">
+          <w:hyperlink w:anchor="_Toc193815408" w:history="1">
             <w:r>
               <w:rPr>
                 <w:rStyle w:val="Hyperlink"/>
@@ -821,7 +804,7 @@
                 <w:noProof/>
                 <w:webHidden/>
               </w:rPr>
-              <w:instrText xml:space="preserve"> PAGEREF _Toc193295089 \h </w:instrText>
+              <w:instrText xml:space="preserve"> PAGEREF _Toc193815408 \h </w:instrText>
             </w:r>
             <w:r>
               <w:rPr>
@@ -861,12 +844,12 @@
             <w:rPr>
               <w:rFonts w:eastAsiaTheme="minorEastAsia"/>
               <w:noProof/>
-              <w:kern w:val="0"/>
+              <w:sz w:val="24"/>
+              <w:szCs w:val="24"/>
               <w:lang w:eastAsia="en-GB"/>
-              <w14:ligatures w14:val="none"/>
             </w:rPr>
           </w:pPr>
-          <w:hyperlink w:anchor="_Toc193295090" w:history="1">
+          <w:hyperlink w:anchor="_Toc193815409" w:history="1">
             <w:r>
               <w:rPr>
                 <w:rStyle w:val="Hyperlink"/>
@@ -894,7 +877,7 @@
                 <w:noProof/>
                 <w:webHidden/>
               </w:rPr>
-              <w:instrText xml:space="preserve"> PAGEREF _Toc193295090 \h </w:instrText>
+              <w:instrText xml:space="preserve"> PAGEREF _Toc193815409 \h </w:instrText>
             </w:r>
             <w:r>
               <w:rPr>
@@ -934,12 +917,12 @@
             <w:rPr>
               <w:rFonts w:eastAsiaTheme="minorEastAsia"/>
               <w:noProof/>
-              <w:kern w:val="0"/>
+              <w:sz w:val="24"/>
+              <w:szCs w:val="24"/>
               <w:lang w:eastAsia="en-GB"/>
-              <w14:ligatures w14:val="none"/>
             </w:rPr>
           </w:pPr>
-          <w:hyperlink w:anchor="_Toc193295091" w:history="1">
+          <w:hyperlink w:anchor="_Toc193815410" w:history="1">
             <w:r>
               <w:rPr>
                 <w:rStyle w:val="Hyperlink"/>
@@ -967,7 +950,7 @@
                 <w:noProof/>
                 <w:webHidden/>
               </w:rPr>
-              <w:instrText xml:space="preserve"> PAGEREF _Toc193295091 \h </w:instrText>
+              <w:instrText xml:space="preserve"> PAGEREF _Toc193815410 \h </w:instrText>
             </w:r>
             <w:r>
               <w:rPr>
@@ -1007,12 +990,12 @@
             <w:rPr>
               <w:rFonts w:eastAsiaTheme="minorEastAsia"/>
               <w:noProof/>
-              <w:kern w:val="0"/>
+              <w:sz w:val="24"/>
+              <w:szCs w:val="24"/>
               <w:lang w:eastAsia="en-GB"/>
-              <w14:ligatures w14:val="none"/>
             </w:rPr>
           </w:pPr>
-          <w:hyperlink w:anchor="_Toc193295092" w:history="1">
+          <w:hyperlink w:anchor="_Toc193815411" w:history="1">
             <w:r>
               <w:rPr>
                 <w:rStyle w:val="Hyperlink"/>
@@ -1040,7 +1023,7 @@
                 <w:noProof/>
                 <w:webHidden/>
               </w:rPr>
-              <w:instrText xml:space="preserve"> PAGEREF _Toc193295092 \h </w:instrText>
+              <w:instrText xml:space="preserve"> PAGEREF _Toc193815411 \h </w:instrText>
             </w:r>
             <w:r>
               <w:rPr>
@@ -1080,12 +1063,12 @@
             <w:rPr>
               <w:rFonts w:eastAsiaTheme="minorEastAsia"/>
               <w:noProof/>
-              <w:kern w:val="0"/>
+              <w:sz w:val="24"/>
+              <w:szCs w:val="24"/>
               <w:lang w:eastAsia="en-GB"/>
-              <w14:ligatures w14:val="none"/>
             </w:rPr>
           </w:pPr>
-          <w:hyperlink w:anchor="_Toc193295093" w:history="1">
+          <w:hyperlink w:anchor="_Toc193815412" w:history="1">
             <w:r>
               <w:rPr>
                 <w:rStyle w:val="Hyperlink"/>
@@ -1113,7 +1096,7 @@
                 <w:noProof/>
                 <w:webHidden/>
               </w:rPr>
-              <w:instrText xml:space="preserve"> PAGEREF _Toc193295093 \h </w:instrText>
+              <w:instrText xml:space="preserve"> PAGEREF _Toc193815412 \h </w:instrText>
             </w:r>
             <w:r>
               <w:rPr>
@@ -1145,78 +1128,6 @@
           </w:hyperlink>
         </w:p>
         <w:p>
-          <w:pPr>
-            <w:pStyle w:val="TOC1"/>
-            <w:tabs>
-              <w:tab w:val="right" w:leader="dot" w:pos="9016"/>
-            </w:tabs>
-            <w:rPr>
-              <w:rFonts w:eastAsiaTheme="minorEastAsia"/>
-              <w:noProof/>
-              <w:kern w:val="0"/>
-              <w:lang w:eastAsia="en-GB"/>
-              <w14:ligatures w14:val="none"/>
-            </w:rPr>
-          </w:pPr>
-          <w:hyperlink w:anchor="_Toc193295094" w:history="1">
-            <w:r>
-              <w:rPr>
-                <w:rStyle w:val="Hyperlink"/>
-                <w:noProof/>
-              </w:rPr>
-              <w:t>8. Flashcard maker</w:t>
-            </w:r>
-            <w:r>
-              <w:rPr>
-                <w:noProof/>
-                <w:webHidden/>
-              </w:rPr>
-              <w:tab/>
-            </w:r>
-            <w:r>
-              <w:rPr>
-                <w:noProof/>
-                <w:webHidden/>
-              </w:rPr>
-              <w:fldChar w:fldCharType="begin"/>
-            </w:r>
-            <w:r>
-              <w:rPr>
-                <w:noProof/>
-                <w:webHidden/>
-              </w:rPr>
-              <w:instrText xml:space="preserve"> PAGEREF _Toc193295094 \h </w:instrText>
-            </w:r>
-            <w:r>
-              <w:rPr>
-                <w:noProof/>
-                <w:webHidden/>
-              </w:rPr>
-            </w:r>
-            <w:r>
-              <w:rPr>
-                <w:noProof/>
-                <w:webHidden/>
-              </w:rPr>
-              <w:fldChar w:fldCharType="separate"/>
-            </w:r>
-            <w:r>
-              <w:rPr>
-                <w:noProof/>
-                <w:webHidden/>
-              </w:rPr>
-              <w:t>12</w:t>
-            </w:r>
-            <w:r>
-              <w:rPr>
-                <w:noProof/>
-                <w:webHidden/>
-              </w:rPr>
-              <w:fldChar w:fldCharType="end"/>
-            </w:r>
-          </w:hyperlink>
-        </w:p>
-        <w:p>
           <w:r>
             <w:fldChar w:fldCharType="end"/>
           </w:r>
@@ -1437,11 +1348,12 @@
           <w:lang w:val="en-IN"/>
         </w:rPr>
       </w:pPr>
-      <w:bookmarkStart w:id="0" w:name="_Toc193295087"/>
-      <w:r>
-        <w:rPr>
-          <w:lang w:val="en-IN"/>
-        </w:rPr>
+      <w:bookmarkStart w:id="0" w:name="_Toc193815406"/>
+      <w:r>
+        <w:rPr>
+          <w:lang w:val="en-IN"/>
+        </w:rPr>
+        <w:lastRenderedPageBreak/>
         <w:t>1. Login / Registration</w:t>
       </w:r>
       <w:bookmarkEnd w:id="0"/>
@@ -1769,7 +1681,7 @@
           <w:lang w:val="en-IN"/>
         </w:rPr>
       </w:pPr>
-      <w:bookmarkStart w:id="1" w:name="_Toc193295088"/>
+      <w:bookmarkStart w:id="1" w:name="_Toc193815407"/>
       <w:r>
         <w:rPr>
           <w:lang w:val="en-IN"/>
@@ -1985,7 +1897,7 @@
           <w:lang w:val="en-IN"/>
         </w:rPr>
       </w:pPr>
-      <w:bookmarkStart w:id="2" w:name="_Toc193295089"/>
+      <w:bookmarkStart w:id="2" w:name="_Toc193815408"/>
       <w:r>
         <w:rPr>
           <w:lang w:val="en-IN"/>
@@ -2249,7 +2161,7 @@
           <w:lang w:val="en-IN"/>
         </w:rPr>
       </w:pPr>
-      <w:bookmarkStart w:id="3" w:name="_Toc193295090"/>
+      <w:bookmarkStart w:id="3" w:name="_Toc193815409"/>
       <w:r>
         <w:rPr>
           <w:lang w:val="en-IN"/>
@@ -2553,7 +2465,7 @@
           <w:lang w:val="en-IN"/>
         </w:rPr>
       </w:pPr>
-      <w:bookmarkStart w:id="4" w:name="_Toc193295091"/>
+      <w:bookmarkStart w:id="4" w:name="_Toc193815410"/>
       <w:r>
         <w:rPr>
           <w:lang w:val="en-IN"/>
@@ -2762,7 +2674,7 @@
           <w:lang w:val="en-IN"/>
         </w:rPr>
       </w:pPr>
-      <w:bookmarkStart w:id="5" w:name="_Toc193295092"/>
+      <w:bookmarkStart w:id="5" w:name="_Toc193815411"/>
       <w:r>
         <w:rPr>
           <w:lang w:val="en-IN"/>
@@ -2926,11 +2838,20 @@
           <w:b/>
           <w:bCs/>
         </w:rPr>
-        <w:t xml:space="preserve">Dynamic Leaderboard Display </w:t>
+        <w:t xml:space="preserve">Dynamic Leaderboard </w:t>
+      </w:r>
+      <w:proofErr w:type="gramStart"/>
+      <w:r>
+        <w:rPr>
+          <w:b/>
+          <w:bCs/>
+        </w:rPr>
+        <w:t xml:space="preserve">Display </w:t>
       </w:r>
       <w:r>
         <w:t>:</w:t>
       </w:r>
+      <w:proofErr w:type="gramEnd"/>
     </w:p>
     <w:p>
       <w:pPr>
@@ -2959,6 +2880,7 @@
       <w:pPr>
         <w:ind w:left="720"/>
       </w:pPr>
+      <w:proofErr w:type="gramStart"/>
       <w:r>
         <w:rPr>
           <w:b/>
@@ -2969,6 +2891,7 @@
       <w:r>
         <w:t>:</w:t>
       </w:r>
+      <w:proofErr w:type="gramEnd"/>
     </w:p>
     <w:p>
       <w:pPr>
@@ -3001,11 +2924,20 @@
           <w:b/>
           <w:bCs/>
         </w:rPr>
-        <w:t xml:space="preserve">Refresh Button </w:t>
+        <w:t xml:space="preserve">Refresh </w:t>
+      </w:r>
+      <w:proofErr w:type="gramStart"/>
+      <w:r>
+        <w:rPr>
+          <w:b/>
+          <w:bCs/>
+        </w:rPr>
+        <w:t xml:space="preserve">Button </w:t>
       </w:r>
       <w:r>
         <w:t>:</w:t>
       </w:r>
+      <w:proofErr w:type="gramEnd"/>
     </w:p>
     <w:p>
       <w:pPr>
@@ -3027,11 +2959,20 @@
           <w:b/>
           <w:bCs/>
         </w:rPr>
-        <w:t xml:space="preserve">Row Details </w:t>
+        <w:t xml:space="preserve">Row </w:t>
+      </w:r>
+      <w:proofErr w:type="gramStart"/>
+      <w:r>
+        <w:rPr>
+          <w:b/>
+          <w:bCs/>
+        </w:rPr>
+        <w:t xml:space="preserve">Details </w:t>
       </w:r>
       <w:r>
         <w:t>:</w:t>
       </w:r>
+      <w:proofErr w:type="gramEnd"/>
     </w:p>
     <w:p>
       <w:pPr>
@@ -3048,6 +2989,7 @@
       <w:pPr>
         <w:ind w:left="720"/>
       </w:pPr>
+      <w:proofErr w:type="gramStart"/>
       <w:r>
         <w:rPr>
           <w:b/>
@@ -3058,6 +3000,7 @@
       <w:r>
         <w:t>:</w:t>
       </w:r>
+      <w:proofErr w:type="gramEnd"/>
     </w:p>
     <w:p>
       <w:pPr>
@@ -3125,11 +3068,20 @@
           <w:b/>
           <w:bCs/>
         </w:rPr>
-        <w:t xml:space="preserve">"Student XP Leaderboard" </w:t>
+        <w:t>"Student XP Leaderboard</w:t>
+      </w:r>
+      <w:proofErr w:type="gramStart"/>
+      <w:r>
+        <w:rPr>
+          <w:b/>
+          <w:bCs/>
+        </w:rPr>
+        <w:t xml:space="preserve">" </w:t>
       </w:r>
       <w:r>
         <w:t>.</w:t>
       </w:r>
+      <w:proofErr w:type="gramEnd"/>
     </w:p>
     <w:p>
       <w:pPr>
@@ -3167,6 +3119,7 @@
       </w:r>
     </w:p>
     <w:p>
+      <w:proofErr w:type="gramStart"/>
       <w:r>
         <w:rPr>
           <w:b/>
@@ -3175,10 +3128,15 @@
         <w:t xml:space="preserve">Rank </w:t>
       </w:r>
       <w:r>
-        <w:t>: The student's position based on XP.</w:t>
-      </w:r>
-    </w:p>
-    <w:p>
+        <w:t>:</w:t>
+      </w:r>
+      <w:proofErr w:type="gramEnd"/>
+      <w:r>
+        <w:t xml:space="preserve"> The student's position based on XP.</w:t>
+      </w:r>
+    </w:p>
+    <w:p>
+      <w:proofErr w:type="gramStart"/>
       <w:r>
         <w:rPr>
           <w:b/>
@@ -3187,10 +3145,15 @@
         <w:t xml:space="preserve">Username </w:t>
       </w:r>
       <w:r>
-        <w:t>: The name of the student.</w:t>
-      </w:r>
-    </w:p>
-    <w:p>
+        <w:t>:</w:t>
+      </w:r>
+      <w:proofErr w:type="gramEnd"/>
+      <w:r>
+        <w:t xml:space="preserve"> The name of the student.</w:t>
+      </w:r>
+    </w:p>
+    <w:p>
+      <w:proofErr w:type="gramStart"/>
       <w:r>
         <w:rPr>
           <w:b/>
@@ -3199,7 +3162,11 @@
         <w:t xml:space="preserve">XP </w:t>
       </w:r>
       <w:r>
-        <w:t>: The student's experience points.</w:t>
+        <w:t>:</w:t>
+      </w:r>
+      <w:proofErr w:type="gramEnd"/>
+      <w:r>
+        <w:t xml:space="preserve"> The student's experience points.</w:t>
       </w:r>
     </w:p>
     <w:p>
@@ -3243,6 +3210,7 @@
       <w:pPr>
         <w:ind w:left="1440"/>
       </w:pPr>
+      <w:proofErr w:type="gramStart"/>
       <w:r>
         <w:rPr>
           <w:b/>
@@ -3251,13 +3219,18 @@
         <w:t xml:space="preserve">Previous </w:t>
       </w:r>
       <w:r>
-        <w:t>: Navigate to the previous page of students.</w:t>
+        <w:t>:</w:t>
+      </w:r>
+      <w:proofErr w:type="gramEnd"/>
+      <w:r>
+        <w:t xml:space="preserve"> Navigate to the previous page of students.</w:t>
       </w:r>
     </w:p>
     <w:p>
       <w:pPr>
         <w:ind w:left="1440"/>
       </w:pPr>
+      <w:proofErr w:type="gramStart"/>
       <w:r>
         <w:rPr>
           <w:b/>
@@ -3266,13 +3239,18 @@
         <w:t xml:space="preserve">Next </w:t>
       </w:r>
       <w:r>
-        <w:t>: Navigate to the next page of students.</w:t>
+        <w:t>:</w:t>
+      </w:r>
+      <w:proofErr w:type="gramEnd"/>
+      <w:r>
+        <w:t xml:space="preserve"> Navigate to the next page of students.</w:t>
       </w:r>
     </w:p>
     <w:p>
       <w:pPr>
         <w:ind w:left="1440"/>
       </w:pPr>
+      <w:proofErr w:type="gramStart"/>
       <w:r>
         <w:rPr>
           <w:b/>
@@ -3281,7 +3259,11 @@
         <w:t xml:space="preserve">Refresh </w:t>
       </w:r>
       <w:r>
-        <w:t>: Reload the data from the database to reflect any changes.</w:t>
+        <w:t>:</w:t>
+      </w:r>
+      <w:proofErr w:type="gramEnd"/>
+      <w:r>
+        <w:t xml:space="preserve"> Reload the data from the database to reflect any changes.</w:t>
       </w:r>
     </w:p>
     <w:p>
@@ -3350,11 +3332,20 @@
           <w:b/>
           <w:bCs/>
         </w:rPr>
-        <w:t xml:space="preserve">View Student Details </w:t>
+        <w:t xml:space="preserve">View Student </w:t>
+      </w:r>
+      <w:proofErr w:type="gramStart"/>
+      <w:r>
+        <w:rPr>
+          <w:b/>
+          <w:bCs/>
+        </w:rPr>
+        <w:t xml:space="preserve">Details </w:t>
       </w:r>
       <w:r>
         <w:t>:</w:t>
       </w:r>
+      <w:proofErr w:type="gramEnd"/>
     </w:p>
     <w:p>
       <w:pPr>
@@ -3377,11 +3368,20 @@
           <w:b/>
           <w:bCs/>
         </w:rPr>
-        <w:t xml:space="preserve">Navigate Pages </w:t>
+        <w:t xml:space="preserve">Navigate </w:t>
+      </w:r>
+      <w:proofErr w:type="gramStart"/>
+      <w:r>
+        <w:rPr>
+          <w:b/>
+          <w:bCs/>
+        </w:rPr>
+        <w:t xml:space="preserve">Pages </w:t>
       </w:r>
       <w:r>
         <w:t>:</w:t>
       </w:r>
+      <w:proofErr w:type="gramEnd"/>
     </w:p>
     <w:p>
       <w:pPr>
@@ -3423,11 +3423,20 @@
           <w:b/>
           <w:bCs/>
         </w:rPr>
-        <w:t xml:space="preserve">Refresh Data </w:t>
+        <w:t xml:space="preserve">Refresh </w:t>
+      </w:r>
+      <w:proofErr w:type="gramStart"/>
+      <w:r>
+        <w:rPr>
+          <w:b/>
+          <w:bCs/>
+        </w:rPr>
+        <w:t xml:space="preserve">Data </w:t>
       </w:r>
       <w:r>
         <w:t>:</w:t>
       </w:r>
+      <w:proofErr w:type="gramEnd"/>
     </w:p>
     <w:p>
       <w:pPr>
@@ -3527,7 +3536,7 @@
           <w:lang w:val="en-IN"/>
         </w:rPr>
       </w:pPr>
-      <w:bookmarkStart w:id="6" w:name="_Toc193295093"/>
+      <w:bookmarkStart w:id="6" w:name="_Toc193815412"/>
       <w:r>
         <w:rPr>
           <w:lang w:val="en-IN"/>

</xml_diff>